<commit_message>
Changing tasks and reporting
</commit_message>
<xml_diff>
--- a/PereverzaEA_Practice_2nd-course/Задания_ПереверзаЕА.docx
+++ b/PereverzaEA_Practice_2nd-course/Задания_ПереверзаЕА.docx
@@ -344,7 +344,16 @@
           <w:sz w:val="22"/>
           <w:szCs w:val="22"/>
         </w:rPr>
-        <w:t xml:space="preserve">Зав. кафедрой  </w:t>
+        <w:t xml:space="preserve">Зав. </w:t>
+      </w:r>
+      <w:proofErr w:type="gramStart"/>
+      <w:r>
+        <w:rPr>
+          <w:color w:val="000000"/>
+          <w:sz w:val="22"/>
+          <w:szCs w:val="22"/>
+        </w:rPr>
+        <w:t xml:space="preserve">кафедрой  </w:t>
       </w:r>
       <w:proofErr w:type="spellStart"/>
       <w:r>
@@ -362,7 +371,16 @@
           <w:sz w:val="22"/>
           <w:szCs w:val="22"/>
         </w:rPr>
-        <w:t>., проф.</w:t>
+        <w:t>.</w:t>
+      </w:r>
+      <w:proofErr w:type="gramEnd"/>
+      <w:r>
+        <w:rPr>
+          <w:color w:val="000000"/>
+          <w:sz w:val="22"/>
+          <w:szCs w:val="22"/>
+        </w:rPr>
+        <w:t>, проф.</w:t>
       </w:r>
     </w:p>
     <w:p>
@@ -439,13 +457,23 @@
           <w:szCs w:val="22"/>
         </w:rPr>
       </w:pPr>
-      <w:r>
-        <w:rPr>
-          <w:color w:val="000000"/>
-          <w:sz w:val="22"/>
-          <w:szCs w:val="22"/>
-        </w:rPr>
-        <w:t xml:space="preserve">«     » </w:t>
+      <w:proofErr w:type="gramStart"/>
+      <w:r>
+        <w:rPr>
+          <w:color w:val="000000"/>
+          <w:sz w:val="22"/>
+          <w:szCs w:val="22"/>
+        </w:rPr>
+        <w:t xml:space="preserve">«  </w:t>
+      </w:r>
+      <w:proofErr w:type="gramEnd"/>
+      <w:r>
+        <w:rPr>
+          <w:color w:val="000000"/>
+          <w:sz w:val="22"/>
+          <w:szCs w:val="22"/>
+        </w:rPr>
+        <w:t xml:space="preserve">   » </w:t>
       </w:r>
       <w:r>
         <w:rPr>
@@ -1669,6 +1697,22 @@
                 <w:szCs w:val="20"/>
               </w:rPr>
             </w:pPr>
+            <w:r>
+              <w:rPr>
+                <w:color w:val="000000"/>
+                <w:sz w:val="20"/>
+                <w:szCs w:val="20"/>
+              </w:rPr>
+              <w:t>4.09</w:t>
+            </w:r>
+            <w:r>
+              <w:rPr>
+                <w:color w:val="000000"/>
+                <w:sz w:val="20"/>
+                <w:szCs w:val="20"/>
+              </w:rPr>
+              <w:t>.2024</w:t>
+            </w:r>
           </w:p>
         </w:tc>
         <w:tc>
@@ -1698,6 +1742,14 @@
                 <w:szCs w:val="20"/>
               </w:rPr>
             </w:pPr>
+            <w:r>
+              <w:rPr>
+                <w:color w:val="000000"/>
+                <w:sz w:val="20"/>
+                <w:szCs w:val="20"/>
+              </w:rPr>
+              <w:t>4.09.2024</w:t>
+            </w:r>
           </w:p>
         </w:tc>
       </w:tr>
@@ -1836,6 +1888,22 @@
                 <w:szCs w:val="20"/>
               </w:rPr>
             </w:pPr>
+            <w:r>
+              <w:rPr>
+                <w:color w:val="000000"/>
+                <w:sz w:val="20"/>
+                <w:szCs w:val="20"/>
+              </w:rPr>
+              <w:t>6</w:t>
+            </w:r>
+            <w:r>
+              <w:rPr>
+                <w:color w:val="000000"/>
+                <w:sz w:val="20"/>
+                <w:szCs w:val="20"/>
+              </w:rPr>
+              <w:t>.09.2024</w:t>
+            </w:r>
           </w:p>
         </w:tc>
         <w:tc>
@@ -1865,6 +1933,14 @@
                 <w:szCs w:val="20"/>
               </w:rPr>
             </w:pPr>
+            <w:r>
+              <w:rPr>
+                <w:color w:val="000000"/>
+                <w:sz w:val="20"/>
+                <w:szCs w:val="20"/>
+              </w:rPr>
+              <w:t>17.09.2024</w:t>
+            </w:r>
           </w:p>
         </w:tc>
       </w:tr>
@@ -1955,13 +2031,11 @@
               </w:pBdr>
               <w:rPr>
                 <w:color w:val="000000"/>
-                <w:lang/>
-              </w:rPr>
-            </w:pPr>
-            <w:r>
-              <w:rPr>
-                <w:color w:val="000000"/>
-                <w:lang/>
+              </w:rPr>
+            </w:pPr>
+            <w:r>
+              <w:rPr>
+                <w:color w:val="000000"/>
               </w:rPr>
               <w:t xml:space="preserve">Текстовый документ (опубликовать в электронном портфолио, </w:t>
             </w:r>
@@ -1981,7 +2055,6 @@
             <w:r>
               <w:rPr>
                 <w:color w:val="000000"/>
-                <w:lang/>
               </w:rPr>
               <w:t>)</w:t>
             </w:r>
@@ -2002,7 +2075,6 @@
                 <w:sz w:val="22"/>
                 <w:szCs w:val="22"/>
                 <w:highlight w:val="red"/>
-                <w:lang/>
               </w:rPr>
             </w:pPr>
           </w:p>
@@ -2035,6 +2107,14 @@
                 <w:highlight w:val="red"/>
               </w:rPr>
             </w:pPr>
+            <w:r>
+              <w:rPr>
+                <w:color w:val="000000"/>
+                <w:sz w:val="20"/>
+                <w:szCs w:val="20"/>
+              </w:rPr>
+              <w:t>7.09.2024</w:t>
+            </w:r>
           </w:p>
         </w:tc>
         <w:tc>
@@ -2065,6 +2145,14 @@
                 <w:highlight w:val="red"/>
               </w:rPr>
             </w:pPr>
+            <w:r>
+              <w:rPr>
+                <w:color w:val="000000"/>
+                <w:sz w:val="20"/>
+                <w:szCs w:val="20"/>
+              </w:rPr>
+              <w:t>7.09.2024</w:t>
+            </w:r>
           </w:p>
         </w:tc>
       </w:tr>
@@ -2307,6 +2395,867 @@
           <w:p>
             <w:pPr>
               <w:pStyle w:val="10"/>
+              <w:tabs>
+                <w:tab w:val="left" w:pos="560"/>
+                <w:tab w:val="left" w:pos="1120"/>
+                <w:tab w:val="left" w:pos="1680"/>
+                <w:tab w:val="left" w:pos="2240"/>
+                <w:tab w:val="left" w:pos="2800"/>
+                <w:tab w:val="left" w:pos="3360"/>
+                <w:tab w:val="left" w:pos="3920"/>
+                <w:tab w:val="left" w:pos="4480"/>
+                <w:tab w:val="left" w:pos="5040"/>
+                <w:tab w:val="left" w:pos="5600"/>
+                <w:tab w:val="left" w:pos="6160"/>
+                <w:tab w:val="left" w:pos="6720"/>
+              </w:tabs>
+              <w:spacing w:after="200"/>
+              <w:jc w:val="both"/>
+            </w:pPr>
+          </w:p>
+        </w:tc>
+        <w:tc>
+          <w:tcPr>
+            <w:tcW w:w="2552" w:type="dxa"/>
+            <w:vMerge w:val="restart"/>
+            <w:tcBorders>
+              <w:top w:val="single" w:sz="4" w:space="0" w:color="000000"/>
+              <w:left w:val="single" w:sz="4" w:space="0" w:color="000000"/>
+              <w:bottom w:val="single" w:sz="4" w:space="0" w:color="000000"/>
+              <w:right w:val="single" w:sz="4" w:space="0" w:color="000000"/>
+            </w:tcBorders>
+          </w:tcPr>
+          <w:p>
+            <w:pPr>
+              <w:pStyle w:val="10"/>
+              <w:pBdr>
+                <w:top w:val="nil"/>
+                <w:left w:val="nil"/>
+                <w:bottom w:val="nil"/>
+                <w:right w:val="nil"/>
+                <w:between w:val="nil"/>
+              </w:pBdr>
+              <w:tabs>
+                <w:tab w:val="left" w:pos="-15"/>
+              </w:tabs>
+              <w:spacing w:after="200"/>
+              <w:rPr>
+                <w:color w:val="000000"/>
+              </w:rPr>
+            </w:pPr>
+            <w:r>
+              <w:rPr>
+                <w:color w:val="000000"/>
+              </w:rPr>
+              <w:t xml:space="preserve">Текстовый </w:t>
+            </w:r>
+            <w:r>
+              <w:rPr>
+                <w:color w:val="000000"/>
+              </w:rPr>
+              <w:t>документ</w:t>
+            </w:r>
+          </w:p>
+          <w:p>
+            <w:pPr>
+              <w:pStyle w:val="10"/>
+              <w:tabs>
+                <w:tab w:val="left" w:pos="-15"/>
+              </w:tabs>
+              <w:spacing w:after="200" w:line="276" w:lineRule="auto"/>
+              <w:rPr>
+                <w:rFonts w:ascii="Calibri" w:eastAsia="Calibri" w:hAnsi="Calibri" w:cs="Calibri"/>
+                <w:sz w:val="22"/>
+                <w:szCs w:val="22"/>
+              </w:rPr>
+            </w:pPr>
+            <w:r>
+              <w:t xml:space="preserve">Задание </w:t>
+            </w:r>
+            <w:r>
+              <w:t xml:space="preserve">опубликовать в электронном портфолио, </w:t>
+            </w:r>
+            <w:r>
+              <w:rPr>
+                <w:color w:val="000000"/>
+                <w:lang w:val="en-US"/>
+              </w:rPr>
+              <w:t>QR</w:t>
+            </w:r>
+            <w:r>
+              <w:rPr>
+                <w:color w:val="000000"/>
+              </w:rPr>
+              <w:t>-код в отчете.</w:t>
+            </w:r>
+          </w:p>
+        </w:tc>
+        <w:tc>
+          <w:tcPr>
+            <w:tcW w:w="1134" w:type="dxa"/>
+            <w:vMerge w:val="restart"/>
+            <w:tcBorders>
+              <w:top w:val="single" w:sz="4" w:space="0" w:color="000000"/>
+              <w:left w:val="single" w:sz="4" w:space="0" w:color="000000"/>
+              <w:bottom w:val="single" w:sz="4" w:space="0" w:color="000000"/>
+              <w:right w:val="single" w:sz="4" w:space="0" w:color="000000"/>
+            </w:tcBorders>
+          </w:tcPr>
+          <w:p>
+            <w:pPr>
+              <w:pStyle w:val="10"/>
+              <w:pBdr>
+                <w:top w:val="nil"/>
+                <w:left w:val="nil"/>
+                <w:bottom w:val="nil"/>
+                <w:right w:val="nil"/>
+                <w:between w:val="nil"/>
+              </w:pBdr>
+              <w:jc w:val="both"/>
+              <w:rPr>
+                <w:color w:val="000000"/>
+                <w:sz w:val="20"/>
+                <w:szCs w:val="20"/>
+              </w:rPr>
+            </w:pPr>
+            <w:r>
+              <w:rPr>
+                <w:color w:val="000000"/>
+                <w:sz w:val="20"/>
+                <w:szCs w:val="20"/>
+              </w:rPr>
+              <w:t>8</w:t>
+            </w:r>
+            <w:r>
+              <w:rPr>
+                <w:color w:val="000000"/>
+                <w:sz w:val="20"/>
+                <w:szCs w:val="20"/>
+              </w:rPr>
+              <w:t>.09.2024</w:t>
+            </w:r>
+          </w:p>
+        </w:tc>
+        <w:tc>
+          <w:tcPr>
+            <w:tcW w:w="1498" w:type="dxa"/>
+            <w:vMerge w:val="restart"/>
+            <w:tcBorders>
+              <w:top w:val="single" w:sz="4" w:space="0" w:color="000000"/>
+              <w:left w:val="single" w:sz="4" w:space="0" w:color="000000"/>
+              <w:bottom w:val="single" w:sz="4" w:space="0" w:color="000000"/>
+              <w:right w:val="single" w:sz="4" w:space="0" w:color="000000"/>
+            </w:tcBorders>
+          </w:tcPr>
+          <w:p>
+            <w:pPr>
+              <w:pStyle w:val="10"/>
+              <w:pBdr>
+                <w:top w:val="nil"/>
+                <w:left w:val="nil"/>
+                <w:bottom w:val="nil"/>
+                <w:right w:val="nil"/>
+                <w:between w:val="nil"/>
+              </w:pBdr>
+              <w:jc w:val="both"/>
+              <w:rPr>
+                <w:color w:val="000000"/>
+                <w:sz w:val="20"/>
+                <w:szCs w:val="20"/>
+              </w:rPr>
+            </w:pPr>
+            <w:r>
+              <w:rPr>
+                <w:color w:val="000000"/>
+                <w:sz w:val="20"/>
+                <w:szCs w:val="20"/>
+              </w:rPr>
+              <w:t>8</w:t>
+            </w:r>
+            <w:r>
+              <w:rPr>
+                <w:color w:val="000000"/>
+                <w:sz w:val="20"/>
+                <w:szCs w:val="20"/>
+              </w:rPr>
+              <w:t>.09.2024</w:t>
+            </w:r>
+          </w:p>
+        </w:tc>
+      </w:tr>
+      <w:tr>
+        <w:trPr>
+          <w:trHeight w:val="480"/>
+        </w:trPr>
+        <w:tc>
+          <w:tcPr>
+            <w:tcW w:w="4536" w:type="dxa"/>
+            <w:vMerge/>
+            <w:tcBorders>
+              <w:top w:val="single" w:sz="4" w:space="0" w:color="000000"/>
+              <w:left w:val="single" w:sz="4" w:space="0" w:color="000000"/>
+              <w:bottom w:val="single" w:sz="4" w:space="0" w:color="000000"/>
+              <w:right w:val="single" w:sz="4" w:space="0" w:color="000000"/>
+            </w:tcBorders>
+          </w:tcPr>
+          <w:p>
+            <w:pPr>
+              <w:pStyle w:val="10"/>
+              <w:pBdr>
+                <w:top w:val="nil"/>
+                <w:left w:val="nil"/>
+                <w:bottom w:val="nil"/>
+                <w:right w:val="nil"/>
+                <w:between w:val="nil"/>
+              </w:pBdr>
+              <w:tabs>
+                <w:tab w:val="left" w:pos="560"/>
+                <w:tab w:val="left" w:pos="1120"/>
+                <w:tab w:val="left" w:pos="1680"/>
+                <w:tab w:val="left" w:pos="2240"/>
+                <w:tab w:val="left" w:pos="2800"/>
+                <w:tab w:val="left" w:pos="3360"/>
+                <w:tab w:val="left" w:pos="3920"/>
+                <w:tab w:val="left" w:pos="4480"/>
+                <w:tab w:val="left" w:pos="5040"/>
+                <w:tab w:val="left" w:pos="5600"/>
+                <w:tab w:val="left" w:pos="6160"/>
+                <w:tab w:val="left" w:pos="6720"/>
+              </w:tabs>
+              <w:rPr>
+                <w:rFonts w:ascii="Calibri" w:eastAsia="Calibri" w:hAnsi="Calibri" w:cs="Calibri"/>
+                <w:color w:val="000000"/>
+                <w:sz w:val="22"/>
+                <w:szCs w:val="22"/>
+              </w:rPr>
+            </w:pPr>
+          </w:p>
+        </w:tc>
+        <w:tc>
+          <w:tcPr>
+            <w:tcW w:w="2552" w:type="dxa"/>
+            <w:vMerge/>
+            <w:tcBorders>
+              <w:top w:val="single" w:sz="4" w:space="0" w:color="000000"/>
+              <w:left w:val="single" w:sz="4" w:space="0" w:color="000000"/>
+              <w:bottom w:val="single" w:sz="4" w:space="0" w:color="000000"/>
+              <w:right w:val="single" w:sz="4" w:space="0" w:color="000000"/>
+            </w:tcBorders>
+          </w:tcPr>
+          <w:p>
+            <w:pPr>
+              <w:pStyle w:val="10"/>
+              <w:pBdr>
+                <w:top w:val="nil"/>
+                <w:left w:val="nil"/>
+                <w:bottom w:val="nil"/>
+                <w:right w:val="nil"/>
+                <w:between w:val="nil"/>
+              </w:pBdr>
+              <w:tabs>
+                <w:tab w:val="left" w:pos="-15"/>
+              </w:tabs>
+              <w:rPr>
+                <w:rFonts w:ascii="Calibri" w:eastAsia="Calibri" w:hAnsi="Calibri" w:cs="Calibri"/>
+                <w:color w:val="000000"/>
+                <w:sz w:val="22"/>
+                <w:szCs w:val="22"/>
+              </w:rPr>
+            </w:pPr>
+          </w:p>
+        </w:tc>
+        <w:tc>
+          <w:tcPr>
+            <w:tcW w:w="1134" w:type="dxa"/>
+            <w:vMerge/>
+            <w:tcBorders>
+              <w:top w:val="single" w:sz="4" w:space="0" w:color="000000"/>
+              <w:left w:val="single" w:sz="4" w:space="0" w:color="000000"/>
+              <w:bottom w:val="single" w:sz="4" w:space="0" w:color="000000"/>
+              <w:right w:val="single" w:sz="4" w:space="0" w:color="000000"/>
+            </w:tcBorders>
+          </w:tcPr>
+          <w:p>
+            <w:pPr>
+              <w:pStyle w:val="10"/>
+              <w:pBdr>
+                <w:top w:val="nil"/>
+                <w:left w:val="nil"/>
+                <w:bottom w:val="nil"/>
+                <w:right w:val="nil"/>
+                <w:between w:val="nil"/>
+              </w:pBdr>
+              <w:jc w:val="both"/>
+              <w:rPr>
+                <w:color w:val="000000"/>
+                <w:sz w:val="20"/>
+                <w:szCs w:val="20"/>
+              </w:rPr>
+            </w:pPr>
+          </w:p>
+        </w:tc>
+        <w:tc>
+          <w:tcPr>
+            <w:tcW w:w="1498" w:type="dxa"/>
+            <w:vMerge/>
+            <w:tcBorders>
+              <w:top w:val="single" w:sz="4" w:space="0" w:color="000000"/>
+              <w:left w:val="single" w:sz="4" w:space="0" w:color="000000"/>
+              <w:bottom w:val="single" w:sz="4" w:space="0" w:color="000000"/>
+              <w:right w:val="single" w:sz="4" w:space="0" w:color="000000"/>
+            </w:tcBorders>
+          </w:tcPr>
+          <w:p>
+            <w:pPr>
+              <w:pStyle w:val="10"/>
+              <w:pBdr>
+                <w:top w:val="nil"/>
+                <w:left w:val="nil"/>
+                <w:bottom w:val="nil"/>
+                <w:right w:val="nil"/>
+                <w:between w:val="nil"/>
+              </w:pBdr>
+              <w:jc w:val="both"/>
+              <w:rPr>
+                <w:color w:val="000000"/>
+                <w:sz w:val="20"/>
+                <w:szCs w:val="20"/>
+              </w:rPr>
+            </w:pPr>
+          </w:p>
+        </w:tc>
+      </w:tr>
+      <w:tr>
+        <w:trPr>
+          <w:trHeight w:val="517"/>
+        </w:trPr>
+        <w:tc>
+          <w:tcPr>
+            <w:tcW w:w="4536" w:type="dxa"/>
+            <w:vMerge w:val="restart"/>
+            <w:tcBorders>
+              <w:top w:val="single" w:sz="4" w:space="0" w:color="000000"/>
+              <w:left w:val="single" w:sz="4" w:space="0" w:color="000000"/>
+              <w:bottom w:val="single" w:sz="4" w:space="0" w:color="000000"/>
+              <w:right w:val="single" w:sz="4" w:space="0" w:color="000000"/>
+            </w:tcBorders>
+          </w:tcPr>
+          <w:p>
+            <w:pPr>
+              <w:pStyle w:val="10"/>
+              <w:tabs>
+                <w:tab w:val="left" w:pos="560"/>
+                <w:tab w:val="left" w:pos="1120"/>
+                <w:tab w:val="left" w:pos="1680"/>
+                <w:tab w:val="left" w:pos="2240"/>
+                <w:tab w:val="left" w:pos="2800"/>
+                <w:tab w:val="left" w:pos="3360"/>
+                <w:tab w:val="left" w:pos="3920"/>
+                <w:tab w:val="left" w:pos="4480"/>
+                <w:tab w:val="left" w:pos="5040"/>
+                <w:tab w:val="left" w:pos="5600"/>
+                <w:tab w:val="left" w:pos="6160"/>
+                <w:tab w:val="left" w:pos="6720"/>
+              </w:tabs>
+              <w:spacing w:after="200"/>
+              <w:jc w:val="both"/>
+              <w:rPr>
+                <w:color w:val="000000"/>
+              </w:rPr>
+            </w:pPr>
+            <w:r>
+              <w:lastRenderedPageBreak/>
+              <w:t xml:space="preserve">2.2. </w:t>
+            </w:r>
+            <w:r>
+              <w:rPr>
+                <w:color w:val="000000"/>
+              </w:rPr>
+              <w:t xml:space="preserve">На основе предоставленных материалов и рекомендаций, представленных </w:t>
+            </w:r>
+            <w:r>
+              <w:rPr>
+                <w:color w:val="000000"/>
+              </w:rPr>
+              <w:t xml:space="preserve">в курсе </w:t>
+            </w:r>
+            <w:r>
+              <w:rPr>
+                <w:color w:val="000000"/>
+                <w:lang w:val="en-US"/>
+              </w:rPr>
+              <w:t>Moodle</w:t>
+            </w:r>
+            <w:r>
+              <w:rPr>
+                <w:color w:val="000000"/>
+              </w:rPr>
+              <w:t xml:space="preserve">, необходимо настроить и развернуть среду программирования на языке </w:t>
+            </w:r>
+            <w:proofErr w:type="spellStart"/>
+            <w:r>
+              <w:rPr>
+                <w:color w:val="000000"/>
+              </w:rPr>
+              <w:t>Julia</w:t>
+            </w:r>
+            <w:proofErr w:type="spellEnd"/>
+            <w:r>
+              <w:rPr>
+                <w:color w:val="000000"/>
+              </w:rPr>
+              <w:t xml:space="preserve"> с использованием интегрированной среды разработки Visual Studio Code. После этого, используя доступные открытые источники и научные статьи, разработайте решение одной из научных задач, аналогичной той, что была продемонстрирована в </w:t>
+            </w:r>
+            <w:proofErr w:type="spellStart"/>
+            <w:r>
+              <w:rPr>
+                <w:color w:val="000000"/>
+              </w:rPr>
+              <w:t>скринкасте</w:t>
+            </w:r>
+            <w:proofErr w:type="spellEnd"/>
+            <w:r>
+              <w:rPr>
+                <w:color w:val="000000"/>
+              </w:rPr>
+              <w:t>.</w:t>
+            </w:r>
+          </w:p>
+          <w:p>
+            <w:pPr>
+              <w:pStyle w:val="10"/>
+              <w:tabs>
+                <w:tab w:val="left" w:pos="560"/>
+                <w:tab w:val="left" w:pos="1120"/>
+                <w:tab w:val="left" w:pos="1680"/>
+                <w:tab w:val="left" w:pos="2240"/>
+                <w:tab w:val="left" w:pos="2800"/>
+                <w:tab w:val="left" w:pos="3360"/>
+                <w:tab w:val="left" w:pos="3920"/>
+                <w:tab w:val="left" w:pos="4480"/>
+                <w:tab w:val="left" w:pos="5040"/>
+                <w:tab w:val="left" w:pos="5600"/>
+                <w:tab w:val="left" w:pos="6160"/>
+                <w:tab w:val="left" w:pos="6720"/>
+              </w:tabs>
+              <w:spacing w:after="200"/>
+              <w:jc w:val="both"/>
+              <w:rPr>
+                <w:color w:val="000000"/>
+              </w:rPr>
+            </w:pPr>
+          </w:p>
+          <w:p>
+            <w:pPr>
+              <w:pStyle w:val="10"/>
+              <w:tabs>
+                <w:tab w:val="left" w:pos="560"/>
+                <w:tab w:val="left" w:pos="1120"/>
+                <w:tab w:val="left" w:pos="1680"/>
+                <w:tab w:val="left" w:pos="2240"/>
+                <w:tab w:val="left" w:pos="2800"/>
+                <w:tab w:val="left" w:pos="3360"/>
+                <w:tab w:val="left" w:pos="3920"/>
+                <w:tab w:val="left" w:pos="4480"/>
+                <w:tab w:val="left" w:pos="5040"/>
+                <w:tab w:val="left" w:pos="5600"/>
+                <w:tab w:val="left" w:pos="6160"/>
+                <w:tab w:val="left" w:pos="6720"/>
+              </w:tabs>
+              <w:spacing w:after="200"/>
+              <w:jc w:val="both"/>
+              <w:rPr>
+                <w:color w:val="000000"/>
+              </w:rPr>
+            </w:pPr>
+          </w:p>
+          <w:p>
+            <w:pPr>
+              <w:pStyle w:val="10"/>
+              <w:tabs>
+                <w:tab w:val="left" w:pos="560"/>
+                <w:tab w:val="left" w:pos="1120"/>
+                <w:tab w:val="left" w:pos="1680"/>
+                <w:tab w:val="left" w:pos="2240"/>
+                <w:tab w:val="left" w:pos="2800"/>
+                <w:tab w:val="left" w:pos="3360"/>
+                <w:tab w:val="left" w:pos="3920"/>
+                <w:tab w:val="left" w:pos="4480"/>
+                <w:tab w:val="left" w:pos="5040"/>
+                <w:tab w:val="left" w:pos="5600"/>
+                <w:tab w:val="left" w:pos="6160"/>
+                <w:tab w:val="left" w:pos="6720"/>
+              </w:tabs>
+              <w:spacing w:after="200"/>
+              <w:jc w:val="both"/>
+              <w:rPr>
+                <w:color w:val="000000"/>
+              </w:rPr>
+            </w:pPr>
+          </w:p>
+        </w:tc>
+        <w:tc>
+          <w:tcPr>
+            <w:tcW w:w="2552" w:type="dxa"/>
+            <w:vMerge w:val="restart"/>
+            <w:tcBorders>
+              <w:top w:val="single" w:sz="4" w:space="0" w:color="000000"/>
+              <w:left w:val="single" w:sz="4" w:space="0" w:color="000000"/>
+              <w:bottom w:val="single" w:sz="4" w:space="0" w:color="000000"/>
+              <w:right w:val="single" w:sz="4" w:space="0" w:color="000000"/>
+            </w:tcBorders>
+          </w:tcPr>
+          <w:p>
+            <w:pPr>
+              <w:pStyle w:val="ad"/>
+              <w:shd w:val="clear" w:color="auto" w:fill="FFFFFF"/>
+              <w:spacing w:before="0" w:beforeAutospacing="0" w:after="0" w:afterAutospacing="0"/>
+            </w:pPr>
+            <w:r>
+              <w:t xml:space="preserve">Текстовый отчет в виде </w:t>
+            </w:r>
+            <w:proofErr w:type="spellStart"/>
+            <w:r>
+              <w:rPr>
+                <w:lang w:val="en-US"/>
+              </w:rPr>
+              <w:t>ipynb</w:t>
+            </w:r>
+            <w:proofErr w:type="spellEnd"/>
+            <w:r>
+              <w:t>-</w:t>
+            </w:r>
+            <w:r>
+              <w:t>файла</w:t>
+            </w:r>
+          </w:p>
+          <w:p>
+            <w:pPr>
+              <w:pStyle w:val="ad"/>
+              <w:shd w:val="clear" w:color="auto" w:fill="FFFFFF"/>
+              <w:spacing w:before="0" w:beforeAutospacing="0" w:after="0" w:afterAutospacing="0"/>
+            </w:pPr>
+            <w:r>
+              <w:t>(</w:t>
+            </w:r>
+            <w:proofErr w:type="spellStart"/>
+            <w:r>
+              <w:rPr>
+                <w:lang w:val="en-US"/>
+              </w:rPr>
+              <w:t>Jupyter</w:t>
+            </w:r>
+            <w:proofErr w:type="spellEnd"/>
+            <w:r>
+              <w:t xml:space="preserve"> </w:t>
+            </w:r>
+            <w:r>
+              <w:rPr>
+                <w:lang w:val="en-US"/>
+              </w:rPr>
+              <w:t>Notebook</w:t>
+            </w:r>
+            <w:r>
+              <w:t>)</w:t>
+            </w:r>
+            <w:r>
+              <w:br/>
+              <w:t xml:space="preserve">с описанием выполненных шагов </w:t>
+            </w:r>
+          </w:p>
+          <w:p>
+            <w:pPr>
+              <w:pStyle w:val="ad"/>
+              <w:shd w:val="clear" w:color="auto" w:fill="FFFFFF"/>
+              <w:spacing w:before="0" w:beforeAutospacing="0" w:after="0" w:afterAutospacing="0"/>
+            </w:pPr>
+            <w:r>
+              <w:t xml:space="preserve">с настройкой среды </w:t>
+            </w:r>
+          </w:p>
+          <w:p>
+            <w:pPr>
+              <w:pStyle w:val="ad"/>
+              <w:shd w:val="clear" w:color="auto" w:fill="FFFFFF"/>
+              <w:spacing w:before="0" w:beforeAutospacing="0" w:after="0" w:afterAutospacing="0"/>
+            </w:pPr>
+            <w:r>
+              <w:t xml:space="preserve">и решением одной научной задачи </w:t>
+            </w:r>
+          </w:p>
+          <w:p>
+            <w:pPr>
+              <w:pStyle w:val="ad"/>
+              <w:shd w:val="clear" w:color="auto" w:fill="FFFFFF"/>
+              <w:spacing w:before="0" w:beforeAutospacing="0" w:after="0" w:afterAutospacing="0"/>
+            </w:pPr>
+            <w:r>
+              <w:t xml:space="preserve">(проекта). </w:t>
+            </w:r>
+          </w:p>
+          <w:p>
+            <w:pPr>
+              <w:pStyle w:val="ad"/>
+              <w:shd w:val="clear" w:color="auto" w:fill="FFFFFF"/>
+              <w:spacing w:before="0" w:beforeAutospacing="0" w:after="0" w:afterAutospacing="0"/>
+            </w:pPr>
+          </w:p>
+          <w:p>
+            <w:pPr>
+              <w:pStyle w:val="ad"/>
+              <w:shd w:val="clear" w:color="auto" w:fill="FFFFFF"/>
+              <w:spacing w:before="0" w:beforeAutospacing="0" w:after="0" w:afterAutospacing="0"/>
+            </w:pPr>
+          </w:p>
+          <w:p>
+            <w:pPr>
+              <w:pStyle w:val="ad"/>
+              <w:shd w:val="clear" w:color="auto" w:fill="FFFFFF"/>
+              <w:spacing w:before="0" w:beforeAutospacing="0" w:after="0" w:afterAutospacing="0"/>
+            </w:pPr>
+          </w:p>
+          <w:p>
+            <w:pPr>
+              <w:pStyle w:val="ad"/>
+              <w:shd w:val="clear" w:color="auto" w:fill="FFFFFF"/>
+              <w:spacing w:before="0" w:beforeAutospacing="0" w:after="0" w:afterAutospacing="0"/>
+            </w:pPr>
+          </w:p>
+          <w:p>
+            <w:pPr>
+              <w:pStyle w:val="10"/>
+              <w:pBdr>
+                <w:top w:val="nil"/>
+                <w:left w:val="nil"/>
+                <w:bottom w:val="nil"/>
+                <w:right w:val="nil"/>
+                <w:between w:val="nil"/>
+              </w:pBdr>
+            </w:pPr>
+          </w:p>
+        </w:tc>
+        <w:tc>
+          <w:tcPr>
+            <w:tcW w:w="1134" w:type="dxa"/>
+            <w:vMerge w:val="restart"/>
+            <w:tcBorders>
+              <w:top w:val="single" w:sz="4" w:space="0" w:color="000000"/>
+              <w:left w:val="single" w:sz="4" w:space="0" w:color="000000"/>
+              <w:bottom w:val="single" w:sz="4" w:space="0" w:color="000000"/>
+              <w:right w:val="single" w:sz="4" w:space="0" w:color="000000"/>
+            </w:tcBorders>
+          </w:tcPr>
+          <w:p>
+            <w:pPr>
+              <w:pStyle w:val="10"/>
+              <w:pBdr>
+                <w:top w:val="nil"/>
+                <w:left w:val="nil"/>
+                <w:bottom w:val="nil"/>
+                <w:right w:val="nil"/>
+                <w:between w:val="nil"/>
+              </w:pBdr>
+              <w:jc w:val="both"/>
+              <w:rPr>
+                <w:color w:val="000000"/>
+                <w:sz w:val="20"/>
+                <w:szCs w:val="20"/>
+              </w:rPr>
+            </w:pPr>
+            <w:r>
+              <w:rPr>
+                <w:color w:val="000000"/>
+                <w:sz w:val="20"/>
+                <w:szCs w:val="20"/>
+              </w:rPr>
+              <w:t>9.09.2024</w:t>
+            </w:r>
+          </w:p>
+        </w:tc>
+        <w:tc>
+          <w:tcPr>
+            <w:tcW w:w="1498" w:type="dxa"/>
+            <w:vMerge w:val="restart"/>
+            <w:tcBorders>
+              <w:top w:val="single" w:sz="4" w:space="0" w:color="000000"/>
+              <w:left w:val="single" w:sz="4" w:space="0" w:color="000000"/>
+              <w:bottom w:val="single" w:sz="4" w:space="0" w:color="000000"/>
+              <w:right w:val="single" w:sz="4" w:space="0" w:color="000000"/>
+            </w:tcBorders>
+          </w:tcPr>
+          <w:p>
+            <w:pPr>
+              <w:pStyle w:val="10"/>
+              <w:pBdr>
+                <w:top w:val="nil"/>
+                <w:left w:val="nil"/>
+                <w:bottom w:val="nil"/>
+                <w:right w:val="nil"/>
+                <w:between w:val="nil"/>
+              </w:pBdr>
+              <w:jc w:val="both"/>
+              <w:rPr>
+                <w:color w:val="000000"/>
+                <w:sz w:val="20"/>
+                <w:szCs w:val="20"/>
+              </w:rPr>
+            </w:pPr>
+            <w:r>
+              <w:rPr>
+                <w:color w:val="000000"/>
+                <w:sz w:val="20"/>
+                <w:szCs w:val="20"/>
+              </w:rPr>
+              <w:t>14.09.2024</w:t>
+            </w:r>
+          </w:p>
+        </w:tc>
+      </w:tr>
+      <w:tr>
+        <w:trPr>
+          <w:trHeight w:val="480"/>
+        </w:trPr>
+        <w:tc>
+          <w:tcPr>
+            <w:tcW w:w="4536" w:type="dxa"/>
+            <w:vMerge/>
+            <w:tcBorders>
+              <w:top w:val="single" w:sz="4" w:space="0" w:color="000000"/>
+              <w:left w:val="single" w:sz="4" w:space="0" w:color="000000"/>
+              <w:bottom w:val="single" w:sz="4" w:space="0" w:color="000000"/>
+              <w:right w:val="single" w:sz="4" w:space="0" w:color="000000"/>
+            </w:tcBorders>
+          </w:tcPr>
+          <w:p>
+            <w:pPr>
+              <w:pStyle w:val="10"/>
+              <w:pBdr>
+                <w:top w:val="nil"/>
+                <w:left w:val="nil"/>
+                <w:bottom w:val="nil"/>
+                <w:right w:val="nil"/>
+                <w:between w:val="nil"/>
+              </w:pBdr>
+              <w:tabs>
+                <w:tab w:val="left" w:pos="560"/>
+                <w:tab w:val="left" w:pos="1120"/>
+                <w:tab w:val="left" w:pos="1680"/>
+                <w:tab w:val="left" w:pos="2240"/>
+                <w:tab w:val="left" w:pos="2800"/>
+                <w:tab w:val="left" w:pos="3360"/>
+                <w:tab w:val="left" w:pos="3920"/>
+                <w:tab w:val="left" w:pos="4480"/>
+                <w:tab w:val="left" w:pos="5040"/>
+                <w:tab w:val="left" w:pos="5600"/>
+                <w:tab w:val="left" w:pos="6160"/>
+                <w:tab w:val="left" w:pos="6720"/>
+              </w:tabs>
+              <w:jc w:val="both"/>
+              <w:rPr>
+                <w:color w:val="000000"/>
+              </w:rPr>
+            </w:pPr>
+          </w:p>
+        </w:tc>
+        <w:tc>
+          <w:tcPr>
+            <w:tcW w:w="2552" w:type="dxa"/>
+            <w:vMerge/>
+            <w:tcBorders>
+              <w:top w:val="single" w:sz="4" w:space="0" w:color="000000"/>
+              <w:left w:val="single" w:sz="4" w:space="0" w:color="000000"/>
+              <w:bottom w:val="single" w:sz="4" w:space="0" w:color="000000"/>
+              <w:right w:val="single" w:sz="4" w:space="0" w:color="000000"/>
+            </w:tcBorders>
+          </w:tcPr>
+          <w:p>
+            <w:pPr>
+              <w:pStyle w:val="10"/>
+              <w:rPr>
+                <w:color w:val="000000"/>
+              </w:rPr>
+            </w:pPr>
+          </w:p>
+        </w:tc>
+        <w:tc>
+          <w:tcPr>
+            <w:tcW w:w="1134" w:type="dxa"/>
+            <w:vMerge/>
+            <w:tcBorders>
+              <w:top w:val="single" w:sz="4" w:space="0" w:color="000000"/>
+              <w:left w:val="single" w:sz="4" w:space="0" w:color="000000"/>
+              <w:bottom w:val="single" w:sz="4" w:space="0" w:color="000000"/>
+              <w:right w:val="single" w:sz="4" w:space="0" w:color="000000"/>
+            </w:tcBorders>
+          </w:tcPr>
+          <w:p>
+            <w:pPr>
+              <w:pStyle w:val="10"/>
+              <w:pBdr>
+                <w:top w:val="nil"/>
+                <w:left w:val="nil"/>
+                <w:bottom w:val="nil"/>
+                <w:right w:val="nil"/>
+                <w:between w:val="nil"/>
+              </w:pBdr>
+              <w:jc w:val="both"/>
+              <w:rPr>
+                <w:color w:val="000000"/>
+                <w:sz w:val="20"/>
+                <w:szCs w:val="20"/>
+              </w:rPr>
+            </w:pPr>
+          </w:p>
+        </w:tc>
+        <w:tc>
+          <w:tcPr>
+            <w:tcW w:w="1498" w:type="dxa"/>
+            <w:vMerge/>
+            <w:tcBorders>
+              <w:top w:val="single" w:sz="4" w:space="0" w:color="000000"/>
+              <w:left w:val="single" w:sz="4" w:space="0" w:color="000000"/>
+              <w:bottom w:val="single" w:sz="4" w:space="0" w:color="000000"/>
+              <w:right w:val="single" w:sz="4" w:space="0" w:color="000000"/>
+            </w:tcBorders>
+          </w:tcPr>
+          <w:p>
+            <w:pPr>
+              <w:pStyle w:val="10"/>
+              <w:pBdr>
+                <w:top w:val="nil"/>
+                <w:left w:val="nil"/>
+                <w:bottom w:val="nil"/>
+                <w:right w:val="nil"/>
+                <w:between w:val="nil"/>
+              </w:pBdr>
+              <w:jc w:val="both"/>
+              <w:rPr>
+                <w:color w:val="000000"/>
+                <w:sz w:val="20"/>
+                <w:szCs w:val="20"/>
+              </w:rPr>
+            </w:pPr>
+          </w:p>
+        </w:tc>
+      </w:tr>
+      <w:tr>
+        <w:trPr>
+          <w:trHeight w:val="517"/>
+        </w:trPr>
+        <w:tc>
+          <w:tcPr>
+            <w:tcW w:w="4536" w:type="dxa"/>
+            <w:vMerge w:val="restart"/>
+            <w:tcBorders>
+              <w:top w:val="single" w:sz="4" w:space="0" w:color="000000"/>
+              <w:left w:val="single" w:sz="4" w:space="0" w:color="000000"/>
+              <w:bottom w:val="single" w:sz="4" w:space="0" w:color="000000"/>
+              <w:right w:val="single" w:sz="4" w:space="0" w:color="000000"/>
+            </w:tcBorders>
+          </w:tcPr>
+          <w:p>
+            <w:pPr>
+              <w:pStyle w:val="10"/>
               <w:pBdr>
                 <w:top w:val="nil"/>
                 <w:left w:val="nil"/>
@@ -2330,36 +3279,36 @@
               </w:tabs>
               <w:spacing w:after="200" w:line="276" w:lineRule="auto"/>
               <w:jc w:val="both"/>
-              <w:rPr>
-                <w:color w:val="000000"/>
-              </w:rPr>
-            </w:pPr>
-          </w:p>
-          <w:p>
-            <w:pPr>
-              <w:pStyle w:val="10"/>
-              <w:tabs>
-                <w:tab w:val="left" w:pos="560"/>
-                <w:tab w:val="left" w:pos="1120"/>
-                <w:tab w:val="left" w:pos="1680"/>
-                <w:tab w:val="left" w:pos="2240"/>
-                <w:tab w:val="left" w:pos="2800"/>
-                <w:tab w:val="left" w:pos="3360"/>
-                <w:tab w:val="left" w:pos="3920"/>
-                <w:tab w:val="left" w:pos="4480"/>
-                <w:tab w:val="left" w:pos="5040"/>
-                <w:tab w:val="left" w:pos="5600"/>
-                <w:tab w:val="left" w:pos="6160"/>
-                <w:tab w:val="left" w:pos="6720"/>
-              </w:tabs>
-              <w:spacing w:after="200"/>
-              <w:jc w:val="both"/>
-            </w:pPr>
-            <w:r>
-              <w:t xml:space="preserve">2.1. </w:t>
-            </w:r>
-            <w:r>
-              <w:t>Исследовать возможности одного из популярных сервисов для разработчиков (</w:t>
+            </w:pPr>
+            <w:r>
+              <w:t>2.3.</w:t>
+            </w:r>
+            <w:r>
+              <w:t xml:space="preserve"> </w:t>
+            </w:r>
+            <w:r>
+              <w:t xml:space="preserve">Исследовать возможности на выбор одного из клиентов для работы с </w:t>
+            </w:r>
+            <w:r>
+              <w:rPr>
+                <w:lang w:val="en-US"/>
+              </w:rPr>
+              <w:t>Git</w:t>
+            </w:r>
+            <w:r>
+              <w:t xml:space="preserve"> </w:t>
+            </w:r>
+            <w:r>
+              <w:t>при выполнении наиболее распространенных команд, продемонстрировать выполнение команд, особенности конкретного инструмента. Выбор инструмента осуществляется студентом</w:t>
+            </w:r>
+            <w:r>
+              <w:t xml:space="preserve"> из альтернатив</w:t>
+            </w:r>
+            <w:r>
+              <w:t>:</w:t>
+            </w:r>
+            <w:r>
+              <w:t xml:space="preserve"> </w:t>
             </w:r>
             <w:proofErr w:type="spellStart"/>
             <w:r>
@@ -2367,929 +3316,9 @@
             </w:r>
             <w:proofErr w:type="spellEnd"/>
             <w:r>
-              <w:t xml:space="preserve">, </w:t>
-            </w:r>
-            <w:proofErr w:type="spellStart"/>
-            <w:r>
-              <w:t>GitLab</w:t>
-            </w:r>
-            <w:proofErr w:type="spellEnd"/>
-            <w:r>
-              <w:t>) для управления временем (тайм-менеджмента) в контексте задач разработчика.</w:t>
-            </w:r>
-          </w:p>
-          <w:p>
-            <w:pPr>
-              <w:pStyle w:val="10"/>
-              <w:tabs>
-                <w:tab w:val="left" w:pos="560"/>
-                <w:tab w:val="left" w:pos="1120"/>
-                <w:tab w:val="left" w:pos="1680"/>
-                <w:tab w:val="left" w:pos="2240"/>
-                <w:tab w:val="left" w:pos="2800"/>
-                <w:tab w:val="left" w:pos="3360"/>
-                <w:tab w:val="left" w:pos="3920"/>
-                <w:tab w:val="left" w:pos="4480"/>
-                <w:tab w:val="left" w:pos="5040"/>
-                <w:tab w:val="left" w:pos="5600"/>
-                <w:tab w:val="left" w:pos="6160"/>
-                <w:tab w:val="left" w:pos="6720"/>
-              </w:tabs>
-              <w:spacing w:after="200"/>
-              <w:jc w:val="both"/>
-            </w:pPr>
-            <w:r>
-              <w:t>Создать текстовый отчет с результатами анализа, продемонстрировав основные функции одного из сервисов, его достоинства и недостатки, оценить удобство и эффективность работы с ним.</w:t>
-            </w:r>
-          </w:p>
-        </w:tc>
-        <w:tc>
-          <w:tcPr>
-            <w:tcW w:w="2552" w:type="dxa"/>
-            <w:vMerge w:val="restart"/>
-            <w:tcBorders>
-              <w:top w:val="single" w:sz="4" w:space="0" w:color="000000"/>
-              <w:left w:val="single" w:sz="4" w:space="0" w:color="000000"/>
-              <w:bottom w:val="single" w:sz="4" w:space="0" w:color="000000"/>
-              <w:right w:val="single" w:sz="4" w:space="0" w:color="000000"/>
-            </w:tcBorders>
-          </w:tcPr>
-          <w:p>
-            <w:pPr>
-              <w:pStyle w:val="10"/>
-              <w:pBdr>
-                <w:top w:val="nil"/>
-                <w:left w:val="nil"/>
-                <w:bottom w:val="nil"/>
-                <w:right w:val="nil"/>
-                <w:between w:val="nil"/>
-              </w:pBdr>
-              <w:tabs>
-                <w:tab w:val="left" w:pos="-15"/>
-              </w:tabs>
-              <w:spacing w:after="200"/>
-              <w:rPr>
-                <w:color w:val="000000"/>
-              </w:rPr>
-            </w:pPr>
-            <w:r>
-              <w:rPr>
-                <w:color w:val="000000"/>
-              </w:rPr>
-              <w:lastRenderedPageBreak/>
-              <w:t xml:space="preserve">Текстовый </w:t>
-            </w:r>
-            <w:r>
-              <w:rPr>
-                <w:color w:val="000000"/>
-              </w:rPr>
-              <w:t>документ</w:t>
-            </w:r>
-          </w:p>
-          <w:p>
-            <w:pPr>
-              <w:pStyle w:val="10"/>
-              <w:tabs>
-                <w:tab w:val="left" w:pos="-15"/>
-              </w:tabs>
-              <w:spacing w:after="200" w:line="276" w:lineRule="auto"/>
-              <w:rPr>
-                <w:rFonts w:ascii="Calibri" w:eastAsia="Calibri" w:hAnsi="Calibri" w:cs="Calibri"/>
-                <w:sz w:val="22"/>
-                <w:szCs w:val="22"/>
-              </w:rPr>
-            </w:pPr>
-            <w:r>
-              <w:t xml:space="preserve">Задание </w:t>
-            </w:r>
-            <w:r>
-              <w:t xml:space="preserve">опубликовать в электронном портфолио, </w:t>
-            </w:r>
-            <w:r>
-              <w:rPr>
-                <w:color w:val="000000"/>
-                <w:lang w:val="en-US"/>
-              </w:rPr>
-              <w:t>QR</w:t>
-            </w:r>
-            <w:r>
-              <w:rPr>
-                <w:color w:val="000000"/>
-              </w:rPr>
-              <w:t>-код в отчете.</w:t>
-            </w:r>
-          </w:p>
-        </w:tc>
-        <w:tc>
-          <w:tcPr>
-            <w:tcW w:w="1134" w:type="dxa"/>
-            <w:vMerge w:val="restart"/>
-            <w:tcBorders>
-              <w:top w:val="single" w:sz="4" w:space="0" w:color="000000"/>
-              <w:left w:val="single" w:sz="4" w:space="0" w:color="000000"/>
-              <w:bottom w:val="single" w:sz="4" w:space="0" w:color="000000"/>
-              <w:right w:val="single" w:sz="4" w:space="0" w:color="000000"/>
-            </w:tcBorders>
-          </w:tcPr>
-          <w:p>
-            <w:pPr>
-              <w:pStyle w:val="10"/>
-              <w:pBdr>
-                <w:top w:val="nil"/>
-                <w:left w:val="nil"/>
-                <w:bottom w:val="nil"/>
-                <w:right w:val="nil"/>
-                <w:between w:val="nil"/>
-              </w:pBdr>
-              <w:jc w:val="both"/>
-              <w:rPr>
-                <w:color w:val="000000"/>
-                <w:sz w:val="20"/>
-                <w:szCs w:val="20"/>
-              </w:rPr>
-            </w:pPr>
-          </w:p>
-        </w:tc>
-        <w:tc>
-          <w:tcPr>
-            <w:tcW w:w="1498" w:type="dxa"/>
-            <w:vMerge w:val="restart"/>
-            <w:tcBorders>
-              <w:top w:val="single" w:sz="4" w:space="0" w:color="000000"/>
-              <w:left w:val="single" w:sz="4" w:space="0" w:color="000000"/>
-              <w:bottom w:val="single" w:sz="4" w:space="0" w:color="000000"/>
-              <w:right w:val="single" w:sz="4" w:space="0" w:color="000000"/>
-            </w:tcBorders>
-          </w:tcPr>
-          <w:p>
-            <w:pPr>
-              <w:pStyle w:val="10"/>
-              <w:pBdr>
-                <w:top w:val="nil"/>
-                <w:left w:val="nil"/>
-                <w:bottom w:val="nil"/>
-                <w:right w:val="nil"/>
-                <w:between w:val="nil"/>
-              </w:pBdr>
-              <w:jc w:val="both"/>
-              <w:rPr>
-                <w:color w:val="000000"/>
-                <w:sz w:val="20"/>
-                <w:szCs w:val="20"/>
-              </w:rPr>
-            </w:pPr>
-          </w:p>
-        </w:tc>
-      </w:tr>
-      <w:tr>
-        <w:trPr>
-          <w:trHeight w:val="480"/>
-        </w:trPr>
-        <w:tc>
-          <w:tcPr>
-            <w:tcW w:w="4536" w:type="dxa"/>
-            <w:vMerge/>
-            <w:tcBorders>
-              <w:top w:val="single" w:sz="4" w:space="0" w:color="000000"/>
-              <w:left w:val="single" w:sz="4" w:space="0" w:color="000000"/>
-              <w:bottom w:val="single" w:sz="4" w:space="0" w:color="000000"/>
-              <w:right w:val="single" w:sz="4" w:space="0" w:color="000000"/>
-            </w:tcBorders>
-          </w:tcPr>
-          <w:p>
-            <w:pPr>
-              <w:pStyle w:val="10"/>
-              <w:pBdr>
-                <w:top w:val="nil"/>
-                <w:left w:val="nil"/>
-                <w:bottom w:val="nil"/>
-                <w:right w:val="nil"/>
-                <w:between w:val="nil"/>
-              </w:pBdr>
-              <w:tabs>
-                <w:tab w:val="left" w:pos="560"/>
-                <w:tab w:val="left" w:pos="1120"/>
-                <w:tab w:val="left" w:pos="1680"/>
-                <w:tab w:val="left" w:pos="2240"/>
-                <w:tab w:val="left" w:pos="2800"/>
-                <w:tab w:val="left" w:pos="3360"/>
-                <w:tab w:val="left" w:pos="3920"/>
-                <w:tab w:val="left" w:pos="4480"/>
-                <w:tab w:val="left" w:pos="5040"/>
-                <w:tab w:val="left" w:pos="5600"/>
-                <w:tab w:val="left" w:pos="6160"/>
-                <w:tab w:val="left" w:pos="6720"/>
-              </w:tabs>
-              <w:rPr>
-                <w:rFonts w:ascii="Calibri" w:eastAsia="Calibri" w:hAnsi="Calibri" w:cs="Calibri"/>
-                <w:color w:val="000000"/>
-                <w:sz w:val="22"/>
-                <w:szCs w:val="22"/>
-              </w:rPr>
-            </w:pPr>
-          </w:p>
-        </w:tc>
-        <w:tc>
-          <w:tcPr>
-            <w:tcW w:w="2552" w:type="dxa"/>
-            <w:vMerge/>
-            <w:tcBorders>
-              <w:top w:val="single" w:sz="4" w:space="0" w:color="000000"/>
-              <w:left w:val="single" w:sz="4" w:space="0" w:color="000000"/>
-              <w:bottom w:val="single" w:sz="4" w:space="0" w:color="000000"/>
-              <w:right w:val="single" w:sz="4" w:space="0" w:color="000000"/>
-            </w:tcBorders>
-          </w:tcPr>
-          <w:p>
-            <w:pPr>
-              <w:pStyle w:val="10"/>
-              <w:pBdr>
-                <w:top w:val="nil"/>
-                <w:left w:val="nil"/>
-                <w:bottom w:val="nil"/>
-                <w:right w:val="nil"/>
-                <w:between w:val="nil"/>
-              </w:pBdr>
-              <w:tabs>
-                <w:tab w:val="left" w:pos="-15"/>
-              </w:tabs>
-              <w:rPr>
-                <w:rFonts w:ascii="Calibri" w:eastAsia="Calibri" w:hAnsi="Calibri" w:cs="Calibri"/>
-                <w:color w:val="000000"/>
-                <w:sz w:val="22"/>
-                <w:szCs w:val="22"/>
-              </w:rPr>
-            </w:pPr>
-          </w:p>
-        </w:tc>
-        <w:tc>
-          <w:tcPr>
-            <w:tcW w:w="1134" w:type="dxa"/>
-            <w:vMerge/>
-            <w:tcBorders>
-              <w:top w:val="single" w:sz="4" w:space="0" w:color="000000"/>
-              <w:left w:val="single" w:sz="4" w:space="0" w:color="000000"/>
-              <w:bottom w:val="single" w:sz="4" w:space="0" w:color="000000"/>
-              <w:right w:val="single" w:sz="4" w:space="0" w:color="000000"/>
-            </w:tcBorders>
-          </w:tcPr>
-          <w:p>
-            <w:pPr>
-              <w:pStyle w:val="10"/>
-              <w:pBdr>
-                <w:top w:val="nil"/>
-                <w:left w:val="nil"/>
-                <w:bottom w:val="nil"/>
-                <w:right w:val="nil"/>
-                <w:between w:val="nil"/>
-              </w:pBdr>
-              <w:jc w:val="both"/>
-              <w:rPr>
-                <w:color w:val="000000"/>
-                <w:sz w:val="20"/>
-                <w:szCs w:val="20"/>
-              </w:rPr>
-            </w:pPr>
-          </w:p>
-        </w:tc>
-        <w:tc>
-          <w:tcPr>
-            <w:tcW w:w="1498" w:type="dxa"/>
-            <w:vMerge/>
-            <w:tcBorders>
-              <w:top w:val="single" w:sz="4" w:space="0" w:color="000000"/>
-              <w:left w:val="single" w:sz="4" w:space="0" w:color="000000"/>
-              <w:bottom w:val="single" w:sz="4" w:space="0" w:color="000000"/>
-              <w:right w:val="single" w:sz="4" w:space="0" w:color="000000"/>
-            </w:tcBorders>
-          </w:tcPr>
-          <w:p>
-            <w:pPr>
-              <w:pStyle w:val="10"/>
-              <w:pBdr>
-                <w:top w:val="nil"/>
-                <w:left w:val="nil"/>
-                <w:bottom w:val="nil"/>
-                <w:right w:val="nil"/>
-                <w:between w:val="nil"/>
-              </w:pBdr>
-              <w:jc w:val="both"/>
-              <w:rPr>
-                <w:color w:val="000000"/>
-                <w:sz w:val="20"/>
-                <w:szCs w:val="20"/>
-              </w:rPr>
-            </w:pPr>
-          </w:p>
-        </w:tc>
-      </w:tr>
-      <w:tr>
-        <w:trPr>
-          <w:trHeight w:val="517"/>
-        </w:trPr>
-        <w:tc>
-          <w:tcPr>
-            <w:tcW w:w="4536" w:type="dxa"/>
-            <w:vMerge w:val="restart"/>
-            <w:tcBorders>
-              <w:top w:val="single" w:sz="4" w:space="0" w:color="000000"/>
-              <w:left w:val="single" w:sz="4" w:space="0" w:color="000000"/>
-              <w:bottom w:val="single" w:sz="4" w:space="0" w:color="000000"/>
-              <w:right w:val="single" w:sz="4" w:space="0" w:color="000000"/>
-            </w:tcBorders>
-          </w:tcPr>
-          <w:p>
-            <w:pPr>
-              <w:pStyle w:val="10"/>
-              <w:tabs>
-                <w:tab w:val="left" w:pos="560"/>
-                <w:tab w:val="left" w:pos="1120"/>
-                <w:tab w:val="left" w:pos="1680"/>
-                <w:tab w:val="left" w:pos="2240"/>
-                <w:tab w:val="left" w:pos="2800"/>
-                <w:tab w:val="left" w:pos="3360"/>
-                <w:tab w:val="left" w:pos="3920"/>
-                <w:tab w:val="left" w:pos="4480"/>
-                <w:tab w:val="left" w:pos="5040"/>
-                <w:tab w:val="left" w:pos="5600"/>
-                <w:tab w:val="left" w:pos="6160"/>
-                <w:tab w:val="left" w:pos="6720"/>
-              </w:tabs>
-              <w:spacing w:after="200"/>
-              <w:jc w:val="both"/>
-              <w:rPr>
-                <w:color w:val="000000"/>
-              </w:rPr>
-            </w:pPr>
-            <w:r>
-              <w:t xml:space="preserve">2.2. </w:t>
-            </w:r>
-            <w:r>
-              <w:rPr>
-                <w:color w:val="000000"/>
-              </w:rPr>
-              <w:t xml:space="preserve">На основе предоставленных материалов и рекомендаций, представленных </w:t>
-            </w:r>
-            <w:r>
-              <w:rPr>
-                <w:color w:val="000000"/>
-              </w:rPr>
-              <w:t xml:space="preserve">в курсе </w:t>
-            </w:r>
-            <w:r>
-              <w:rPr>
-                <w:color w:val="000000"/>
-                <w:lang w:val="en-US"/>
-              </w:rPr>
-              <w:t>Moodle</w:t>
-            </w:r>
-            <w:r>
-              <w:rPr>
-                <w:color w:val="000000"/>
-              </w:rPr>
-              <w:t xml:space="preserve">, необходимо настроить и развернуть среду программирования на языке </w:t>
-            </w:r>
-            <w:proofErr w:type="spellStart"/>
-            <w:r>
-              <w:rPr>
-                <w:color w:val="000000"/>
-              </w:rPr>
-              <w:t>Julia</w:t>
-            </w:r>
-            <w:proofErr w:type="spellEnd"/>
-            <w:r>
-              <w:rPr>
-                <w:color w:val="000000"/>
-              </w:rPr>
-              <w:t xml:space="preserve"> с использованием интегрированной среды разработки Visual Studio Code. После этого, используя доступные открытые источники и научные статьи, разработайте решение одной из научных задач, аналогичной той, что была продемонстрирована в </w:t>
-            </w:r>
-            <w:proofErr w:type="spellStart"/>
-            <w:r>
-              <w:rPr>
-                <w:color w:val="000000"/>
-              </w:rPr>
-              <w:t>скринкасте</w:t>
-            </w:r>
-            <w:proofErr w:type="spellEnd"/>
-            <w:r>
-              <w:rPr>
-                <w:color w:val="000000"/>
-              </w:rPr>
-              <w:t>.</w:t>
-            </w:r>
-          </w:p>
-          <w:p>
-            <w:pPr>
-              <w:pStyle w:val="10"/>
-              <w:tabs>
-                <w:tab w:val="left" w:pos="560"/>
-                <w:tab w:val="left" w:pos="1120"/>
-                <w:tab w:val="left" w:pos="1680"/>
-                <w:tab w:val="left" w:pos="2240"/>
-                <w:tab w:val="left" w:pos="2800"/>
-                <w:tab w:val="left" w:pos="3360"/>
-                <w:tab w:val="left" w:pos="3920"/>
-                <w:tab w:val="left" w:pos="4480"/>
-                <w:tab w:val="left" w:pos="5040"/>
-                <w:tab w:val="left" w:pos="5600"/>
-                <w:tab w:val="left" w:pos="6160"/>
-                <w:tab w:val="left" w:pos="6720"/>
-              </w:tabs>
-              <w:spacing w:after="200"/>
-              <w:jc w:val="both"/>
-              <w:rPr>
-                <w:color w:val="000000"/>
-              </w:rPr>
-            </w:pPr>
-            <w:r>
-              <w:rPr>
-                <w:color w:val="000000"/>
-              </w:rPr>
-              <w:t xml:space="preserve">2.2. </w:t>
-            </w:r>
-            <w:r>
-              <w:rPr>
-                <w:color w:val="000000"/>
-              </w:rPr>
-              <w:t xml:space="preserve">Составьте подборку материалов, включающую аннотированные статьи и ресурсы по языку программирования </w:t>
-            </w:r>
-            <w:proofErr w:type="spellStart"/>
-            <w:r>
-              <w:rPr>
-                <w:color w:val="000000"/>
-              </w:rPr>
-              <w:t>Julia</w:t>
-            </w:r>
-            <w:proofErr w:type="spellEnd"/>
-            <w:r>
-              <w:rPr>
-                <w:color w:val="000000"/>
-              </w:rPr>
-              <w:t>, а также примеры решения различных задач на этом языке. В подборку должны быть включены выдержки из кода (борды) с соответствующими комментариями и пояснениями.</w:t>
-            </w:r>
-            <w:r>
-              <w:rPr>
-                <w:color w:val="000000"/>
-              </w:rPr>
-              <w:t xml:space="preserve"> </w:t>
-            </w:r>
-            <w:r>
-              <w:rPr>
-                <w:color w:val="000000"/>
-              </w:rPr>
-              <w:t>Выберите одно из предложенных направлений работы и выполните его в соответствии с академическими стандартами</w:t>
-            </w:r>
-            <w:r>
-              <w:rPr>
-                <w:color w:val="000000"/>
-              </w:rPr>
-              <w:t xml:space="preserve">. </w:t>
-            </w:r>
-          </w:p>
-        </w:tc>
-        <w:tc>
-          <w:tcPr>
-            <w:tcW w:w="2552" w:type="dxa"/>
-            <w:vMerge w:val="restart"/>
-            <w:tcBorders>
-              <w:top w:val="single" w:sz="4" w:space="0" w:color="000000"/>
-              <w:left w:val="single" w:sz="4" w:space="0" w:color="000000"/>
-              <w:bottom w:val="single" w:sz="4" w:space="0" w:color="000000"/>
-              <w:right w:val="single" w:sz="4" w:space="0" w:color="000000"/>
-            </w:tcBorders>
-          </w:tcPr>
-          <w:p>
-            <w:pPr>
-              <w:pStyle w:val="ad"/>
-              <w:shd w:val="clear" w:color="auto" w:fill="FFFFFF"/>
-              <w:spacing w:before="0" w:beforeAutospacing="0" w:after="0" w:afterAutospacing="0"/>
-            </w:pPr>
-            <w:r>
-              <w:t xml:space="preserve">Текстовый отчет в виде </w:t>
-            </w:r>
-            <w:proofErr w:type="spellStart"/>
-            <w:r>
-              <w:rPr>
-                <w:lang w:val="en-US"/>
-              </w:rPr>
-              <w:t>ipynb</w:t>
-            </w:r>
-            <w:proofErr w:type="spellEnd"/>
-            <w:r>
-              <w:t>-</w:t>
-            </w:r>
-            <w:r>
-              <w:t>файла</w:t>
-            </w:r>
-          </w:p>
-          <w:p>
-            <w:pPr>
-              <w:pStyle w:val="ad"/>
-              <w:shd w:val="clear" w:color="auto" w:fill="FFFFFF"/>
-              <w:spacing w:before="0" w:beforeAutospacing="0" w:after="0" w:afterAutospacing="0"/>
-            </w:pPr>
-            <w:r>
-              <w:t>(</w:t>
-            </w:r>
-            <w:proofErr w:type="spellStart"/>
-            <w:r>
-              <w:rPr>
-                <w:lang w:val="en-US"/>
-              </w:rPr>
-              <w:t>Jupyter</w:t>
-            </w:r>
-            <w:proofErr w:type="spellEnd"/>
-            <w:r>
-              <w:t xml:space="preserve"> </w:t>
-            </w:r>
-            <w:r>
-              <w:rPr>
-                <w:lang w:val="en-US"/>
-              </w:rPr>
-              <w:t>Notebook</w:t>
-            </w:r>
-            <w:r>
-              <w:t>)</w:t>
-            </w:r>
-            <w:r>
-              <w:br/>
-              <w:t xml:space="preserve">с описанием выполненных шагов </w:t>
-            </w:r>
-          </w:p>
-          <w:p>
-            <w:pPr>
-              <w:pStyle w:val="ad"/>
-              <w:shd w:val="clear" w:color="auto" w:fill="FFFFFF"/>
-              <w:spacing w:before="0" w:beforeAutospacing="0" w:after="0" w:afterAutospacing="0"/>
-            </w:pPr>
-            <w:r>
-              <w:t xml:space="preserve">с настройкой среды </w:t>
-            </w:r>
-          </w:p>
-          <w:p>
-            <w:pPr>
-              <w:pStyle w:val="ad"/>
-              <w:shd w:val="clear" w:color="auto" w:fill="FFFFFF"/>
-              <w:spacing w:before="0" w:beforeAutospacing="0" w:after="0" w:afterAutospacing="0"/>
-            </w:pPr>
-            <w:r>
-              <w:t xml:space="preserve">и решением одной научной задачи </w:t>
-            </w:r>
-          </w:p>
-          <w:p>
-            <w:pPr>
-              <w:pStyle w:val="ad"/>
-              <w:shd w:val="clear" w:color="auto" w:fill="FFFFFF"/>
-              <w:spacing w:before="0" w:beforeAutospacing="0" w:after="0" w:afterAutospacing="0"/>
-            </w:pPr>
-            <w:r>
-              <w:t xml:space="preserve">(проекта). </w:t>
-            </w:r>
-          </w:p>
-          <w:p>
-            <w:pPr>
-              <w:pStyle w:val="ad"/>
-              <w:shd w:val="clear" w:color="auto" w:fill="FFFFFF"/>
-              <w:spacing w:before="0" w:beforeAutospacing="0" w:after="0" w:afterAutospacing="0"/>
-            </w:pPr>
-          </w:p>
-          <w:p>
-            <w:pPr>
-              <w:pStyle w:val="ad"/>
-              <w:shd w:val="clear" w:color="auto" w:fill="FFFFFF"/>
-              <w:spacing w:before="0" w:beforeAutospacing="0" w:after="0" w:afterAutospacing="0"/>
-            </w:pPr>
-          </w:p>
-          <w:p>
-            <w:pPr>
-              <w:pStyle w:val="ad"/>
-              <w:shd w:val="clear" w:color="auto" w:fill="FFFFFF"/>
-              <w:spacing w:before="0" w:beforeAutospacing="0" w:after="0" w:afterAutospacing="0"/>
-            </w:pPr>
-          </w:p>
-          <w:p>
-            <w:pPr>
-              <w:pStyle w:val="ad"/>
-              <w:shd w:val="clear" w:color="auto" w:fill="FFFFFF"/>
-              <w:spacing w:before="0" w:beforeAutospacing="0" w:after="0" w:afterAutospacing="0"/>
-            </w:pPr>
-          </w:p>
-          <w:p>
-            <w:pPr>
-              <w:pStyle w:val="ad"/>
-              <w:shd w:val="clear" w:color="auto" w:fill="FFFFFF"/>
-              <w:spacing w:before="0" w:beforeAutospacing="0" w:after="0" w:afterAutospacing="0"/>
-            </w:pPr>
-            <w:r>
-              <w:t>Аннотированный с</w:t>
-            </w:r>
-            <w:r>
-              <w:t>писок статей:</w:t>
-            </w:r>
-          </w:p>
-          <w:p>
-            <w:pPr>
-              <w:numPr>
-                <w:ilvl w:val="0"/>
-                <w:numId w:val="6"/>
-              </w:numPr>
-              <w:shd w:val="clear" w:color="auto" w:fill="FFFFFF"/>
-              <w:spacing w:after="100" w:afterAutospacing="1" w:line="300" w:lineRule="atLeast"/>
-              <w:ind w:left="375"/>
-            </w:pPr>
-            <w:r>
-              <w:t>название статьи</w:t>
-            </w:r>
-          </w:p>
-          <w:p>
-            <w:pPr>
-              <w:numPr>
-                <w:ilvl w:val="0"/>
-                <w:numId w:val="6"/>
-              </w:numPr>
-              <w:shd w:val="clear" w:color="auto" w:fill="FFFFFF"/>
-              <w:spacing w:before="100" w:beforeAutospacing="1" w:after="100" w:afterAutospacing="1" w:line="300" w:lineRule="atLeast"/>
-              <w:ind w:left="375"/>
-            </w:pPr>
-            <w:r>
-              <w:t>автор</w:t>
-            </w:r>
-          </w:p>
-          <w:p>
-            <w:pPr>
-              <w:numPr>
-                <w:ilvl w:val="0"/>
-                <w:numId w:val="6"/>
-              </w:numPr>
-              <w:shd w:val="clear" w:color="auto" w:fill="FFFFFF"/>
-              <w:spacing w:before="100" w:beforeAutospacing="1" w:after="100" w:afterAutospacing="1" w:line="300" w:lineRule="atLeast"/>
-              <w:ind w:left="375"/>
-            </w:pPr>
-            <w:r>
-              <w:t>ссылка на статью, оформленная с действующим ГОСТом (электронный ресурс)</w:t>
-            </w:r>
-          </w:p>
-          <w:p>
-            <w:pPr>
-              <w:numPr>
-                <w:ilvl w:val="0"/>
-                <w:numId w:val="6"/>
-              </w:numPr>
-              <w:shd w:val="clear" w:color="auto" w:fill="FFFFFF"/>
-              <w:spacing w:before="100" w:beforeAutospacing="1" w:after="100" w:afterAutospacing="1" w:line="300" w:lineRule="atLeast"/>
-              <w:ind w:left="375"/>
-              <w:rPr>
-                <w:rFonts w:ascii="Open Sans" w:hAnsi="Open Sans" w:cs="Open Sans"/>
-                <w:color w:val="555555"/>
-                <w:sz w:val="20"/>
-                <w:szCs w:val="20"/>
-              </w:rPr>
-            </w:pPr>
-            <w:r>
-              <w:t>краткая аннотация</w:t>
-            </w:r>
-          </w:p>
-          <w:p>
-            <w:pPr>
-              <w:pStyle w:val="10"/>
-              <w:pBdr>
-                <w:top w:val="nil"/>
-                <w:left w:val="nil"/>
-                <w:bottom w:val="nil"/>
-                <w:right w:val="nil"/>
-                <w:between w:val="nil"/>
-              </w:pBdr>
-            </w:pPr>
-            <w:r>
-              <w:rPr>
-                <w:color w:val="000000"/>
-              </w:rPr>
-              <w:t xml:space="preserve">Задание </w:t>
-            </w:r>
-            <w:r>
-              <w:rPr>
-                <w:color w:val="000000"/>
-              </w:rPr>
-              <w:t xml:space="preserve">опубликовать в электронном портфолио, </w:t>
-            </w:r>
-            <w:r>
-              <w:rPr>
-                <w:color w:val="000000"/>
-                <w:lang w:val="en-US"/>
-              </w:rPr>
-              <w:t>QR</w:t>
-            </w:r>
-            <w:r>
-              <w:rPr>
-                <w:color w:val="000000"/>
-              </w:rPr>
-              <w:t>-код в отчете)</w:t>
-            </w:r>
-          </w:p>
-        </w:tc>
-        <w:tc>
-          <w:tcPr>
-            <w:tcW w:w="1134" w:type="dxa"/>
-            <w:vMerge w:val="restart"/>
-            <w:tcBorders>
-              <w:top w:val="single" w:sz="4" w:space="0" w:color="000000"/>
-              <w:left w:val="single" w:sz="4" w:space="0" w:color="000000"/>
-              <w:bottom w:val="single" w:sz="4" w:space="0" w:color="000000"/>
-              <w:right w:val="single" w:sz="4" w:space="0" w:color="000000"/>
-            </w:tcBorders>
-          </w:tcPr>
-          <w:p>
-            <w:pPr>
-              <w:pStyle w:val="10"/>
-              <w:pBdr>
-                <w:top w:val="nil"/>
-                <w:left w:val="nil"/>
-                <w:bottom w:val="nil"/>
-                <w:right w:val="nil"/>
-                <w:between w:val="nil"/>
-              </w:pBdr>
-              <w:jc w:val="both"/>
-              <w:rPr>
-                <w:color w:val="000000"/>
-                <w:sz w:val="20"/>
-                <w:szCs w:val="20"/>
-              </w:rPr>
-            </w:pPr>
-          </w:p>
-        </w:tc>
-        <w:tc>
-          <w:tcPr>
-            <w:tcW w:w="1498" w:type="dxa"/>
-            <w:vMerge w:val="restart"/>
-            <w:tcBorders>
-              <w:top w:val="single" w:sz="4" w:space="0" w:color="000000"/>
-              <w:left w:val="single" w:sz="4" w:space="0" w:color="000000"/>
-              <w:bottom w:val="single" w:sz="4" w:space="0" w:color="000000"/>
-              <w:right w:val="single" w:sz="4" w:space="0" w:color="000000"/>
-            </w:tcBorders>
-          </w:tcPr>
-          <w:p>
-            <w:pPr>
-              <w:pStyle w:val="10"/>
-              <w:pBdr>
-                <w:top w:val="nil"/>
-                <w:left w:val="nil"/>
-                <w:bottom w:val="nil"/>
-                <w:right w:val="nil"/>
-                <w:between w:val="nil"/>
-              </w:pBdr>
-              <w:jc w:val="both"/>
-              <w:rPr>
-                <w:color w:val="000000"/>
-                <w:sz w:val="20"/>
-                <w:szCs w:val="20"/>
-              </w:rPr>
-            </w:pPr>
-          </w:p>
-        </w:tc>
-      </w:tr>
-      <w:tr>
-        <w:trPr>
-          <w:trHeight w:val="480"/>
-        </w:trPr>
-        <w:tc>
-          <w:tcPr>
-            <w:tcW w:w="4536" w:type="dxa"/>
-            <w:vMerge/>
-            <w:tcBorders>
-              <w:top w:val="single" w:sz="4" w:space="0" w:color="000000"/>
-              <w:left w:val="single" w:sz="4" w:space="0" w:color="000000"/>
-              <w:bottom w:val="single" w:sz="4" w:space="0" w:color="000000"/>
-              <w:right w:val="single" w:sz="4" w:space="0" w:color="000000"/>
-            </w:tcBorders>
-          </w:tcPr>
-          <w:p>
-            <w:pPr>
-              <w:pStyle w:val="10"/>
-              <w:pBdr>
-                <w:top w:val="nil"/>
-                <w:left w:val="nil"/>
-                <w:bottom w:val="nil"/>
-                <w:right w:val="nil"/>
-                <w:between w:val="nil"/>
-              </w:pBdr>
-              <w:tabs>
-                <w:tab w:val="left" w:pos="560"/>
-                <w:tab w:val="left" w:pos="1120"/>
-                <w:tab w:val="left" w:pos="1680"/>
-                <w:tab w:val="left" w:pos="2240"/>
-                <w:tab w:val="left" w:pos="2800"/>
-                <w:tab w:val="left" w:pos="3360"/>
-                <w:tab w:val="left" w:pos="3920"/>
-                <w:tab w:val="left" w:pos="4480"/>
-                <w:tab w:val="left" w:pos="5040"/>
-                <w:tab w:val="left" w:pos="5600"/>
-                <w:tab w:val="left" w:pos="6160"/>
-                <w:tab w:val="left" w:pos="6720"/>
-              </w:tabs>
-              <w:jc w:val="both"/>
-              <w:rPr>
-                <w:color w:val="000000"/>
-              </w:rPr>
-            </w:pPr>
-          </w:p>
-        </w:tc>
-        <w:tc>
-          <w:tcPr>
-            <w:tcW w:w="2552" w:type="dxa"/>
-            <w:vMerge/>
-            <w:tcBorders>
-              <w:top w:val="single" w:sz="4" w:space="0" w:color="000000"/>
-              <w:left w:val="single" w:sz="4" w:space="0" w:color="000000"/>
-              <w:bottom w:val="single" w:sz="4" w:space="0" w:color="000000"/>
-              <w:right w:val="single" w:sz="4" w:space="0" w:color="000000"/>
-            </w:tcBorders>
-          </w:tcPr>
-          <w:p>
-            <w:pPr>
-              <w:pStyle w:val="10"/>
-              <w:rPr>
-                <w:color w:val="000000"/>
-              </w:rPr>
-            </w:pPr>
-          </w:p>
-        </w:tc>
-        <w:tc>
-          <w:tcPr>
-            <w:tcW w:w="1134" w:type="dxa"/>
-            <w:vMerge/>
-            <w:tcBorders>
-              <w:top w:val="single" w:sz="4" w:space="0" w:color="000000"/>
-              <w:left w:val="single" w:sz="4" w:space="0" w:color="000000"/>
-              <w:bottom w:val="single" w:sz="4" w:space="0" w:color="000000"/>
-              <w:right w:val="single" w:sz="4" w:space="0" w:color="000000"/>
-            </w:tcBorders>
-          </w:tcPr>
-          <w:p>
-            <w:pPr>
-              <w:pStyle w:val="10"/>
-              <w:pBdr>
-                <w:top w:val="nil"/>
-                <w:left w:val="nil"/>
-                <w:bottom w:val="nil"/>
-                <w:right w:val="nil"/>
-                <w:between w:val="nil"/>
-              </w:pBdr>
-              <w:jc w:val="both"/>
-              <w:rPr>
-                <w:color w:val="000000"/>
-                <w:sz w:val="20"/>
-                <w:szCs w:val="20"/>
-              </w:rPr>
-            </w:pPr>
-          </w:p>
-        </w:tc>
-        <w:tc>
-          <w:tcPr>
-            <w:tcW w:w="1498" w:type="dxa"/>
-            <w:vMerge/>
-            <w:tcBorders>
-              <w:top w:val="single" w:sz="4" w:space="0" w:color="000000"/>
-              <w:left w:val="single" w:sz="4" w:space="0" w:color="000000"/>
-              <w:bottom w:val="single" w:sz="4" w:space="0" w:color="000000"/>
-              <w:right w:val="single" w:sz="4" w:space="0" w:color="000000"/>
-            </w:tcBorders>
-          </w:tcPr>
-          <w:p>
-            <w:pPr>
-              <w:pStyle w:val="10"/>
-              <w:pBdr>
-                <w:top w:val="nil"/>
-                <w:left w:val="nil"/>
-                <w:bottom w:val="nil"/>
-                <w:right w:val="nil"/>
-                <w:between w:val="nil"/>
-              </w:pBdr>
-              <w:jc w:val="both"/>
-              <w:rPr>
-                <w:color w:val="000000"/>
-                <w:sz w:val="20"/>
-                <w:szCs w:val="20"/>
-              </w:rPr>
-            </w:pPr>
-          </w:p>
-        </w:tc>
-      </w:tr>
-      <w:tr>
-        <w:trPr>
-          <w:trHeight w:val="517"/>
-        </w:trPr>
-        <w:tc>
-          <w:tcPr>
-            <w:tcW w:w="4536" w:type="dxa"/>
-            <w:vMerge w:val="restart"/>
-            <w:tcBorders>
-              <w:top w:val="single" w:sz="4" w:space="0" w:color="000000"/>
-              <w:left w:val="single" w:sz="4" w:space="0" w:color="000000"/>
-              <w:bottom w:val="single" w:sz="4" w:space="0" w:color="000000"/>
-              <w:right w:val="single" w:sz="4" w:space="0" w:color="000000"/>
-            </w:tcBorders>
-          </w:tcPr>
+              <w:t xml:space="preserve"> Desktop</w:t>
+            </w:r>
+          </w:p>
           <w:p>
             <w:pPr>
               <w:pStyle w:val="10"/>
@@ -3318,43 +3347,13 @@
               <w:jc w:val="both"/>
             </w:pPr>
             <w:r>
-              <w:t>2.3.</w:t>
-            </w:r>
-            <w:r>
-              <w:t xml:space="preserve"> </w:t>
-            </w:r>
-            <w:r>
-              <w:t xml:space="preserve">Исследовать возможности на выбор одного из клиентов для работы с </w:t>
-            </w:r>
-            <w:r>
-              <w:rPr>
-                <w:lang w:val="en-US"/>
-              </w:rPr>
-              <w:t>Git</w:t>
-            </w:r>
-            <w:r>
-              <w:t xml:space="preserve"> </w:t>
-            </w:r>
-            <w:r>
-              <w:t>при выполнении наиболее распространенных команд, продемонстрировать выполнение команд, особенности конкретного инструмента. Выбор инструмента осуществляется студентом</w:t>
-            </w:r>
-            <w:r>
-              <w:t xml:space="preserve"> из альтернатив</w:t>
-            </w:r>
-            <w:r>
-              <w:t>:</w:t>
-            </w:r>
-            <w:r>
-              <w:t xml:space="preserve"> </w:t>
+              <w:t xml:space="preserve">2.3. </w:t>
             </w:r>
             <w:proofErr w:type="spellStart"/>
             <w:r>
-              <w:t>GitHub</w:t>
+              <w:t>Sourcetree</w:t>
             </w:r>
             <w:proofErr w:type="spellEnd"/>
-            <w:r>
-              <w:t xml:space="preserve"> Desktop</w:t>
-            </w:r>
           </w:p>
           <w:p>
             <w:pPr>
@@ -3384,12 +3383,11 @@
               <w:jc w:val="both"/>
             </w:pPr>
             <w:r>
-              <w:lastRenderedPageBreak/>
               <w:t xml:space="preserve">2.3. </w:t>
             </w:r>
             <w:proofErr w:type="spellStart"/>
             <w:r>
-              <w:t>Sourcetree</w:t>
+              <w:t>GitKraken</w:t>
             </w:r>
             <w:proofErr w:type="spellEnd"/>
           </w:p>
@@ -3423,11 +3421,17 @@
             <w:r>
               <w:t xml:space="preserve">2.3. </w:t>
             </w:r>
+            <w:r>
+              <w:t xml:space="preserve">Терминал (Terminal) или Командная строка (или Command Shell </w:t>
+            </w:r>
             <w:proofErr w:type="spellStart"/>
             <w:r>
-              <w:t>GitKraken</w:t>
+              <w:t>Git</w:t>
             </w:r>
             <w:proofErr w:type="spellEnd"/>
+            <w:r>
+              <w:t>)</w:t>
+            </w:r>
           </w:p>
           <w:p>
             <w:pPr>
@@ -3460,15 +3464,7 @@
               <w:t xml:space="preserve">2.3. </w:t>
             </w:r>
             <w:r>
-              <w:t xml:space="preserve">Терминал (Terminal) или Командная строка (или Command Shell </w:t>
-            </w:r>
-            <w:proofErr w:type="spellStart"/>
-            <w:r>
-              <w:t>Git</w:t>
-            </w:r>
-            <w:proofErr w:type="spellEnd"/>
-            <w:r>
-              <w:t>)</w:t>
+              <w:t>Встроенные средства IDE</w:t>
             </w:r>
           </w:p>
           <w:p>
@@ -3498,443 +3494,7 @@
               <w:spacing w:after="200" w:line="276" w:lineRule="auto"/>
               <w:jc w:val="both"/>
             </w:pPr>
-            <w:r>
-              <w:t xml:space="preserve">2.3. </w:t>
-            </w:r>
-            <w:r>
-              <w:t>Встроенные средства IDE</w:t>
-            </w:r>
-          </w:p>
-        </w:tc>
-        <w:tc>
-          <w:tcPr>
-            <w:tcW w:w="2552" w:type="dxa"/>
-            <w:vMerge w:val="restart"/>
-            <w:tcBorders>
-              <w:top w:val="single" w:sz="4" w:space="0" w:color="000000"/>
-              <w:left w:val="single" w:sz="4" w:space="0" w:color="000000"/>
-              <w:bottom w:val="single" w:sz="4" w:space="0" w:color="000000"/>
-              <w:right w:val="single" w:sz="4" w:space="0" w:color="000000"/>
-            </w:tcBorders>
-          </w:tcPr>
-          <w:p>
-            <w:pPr>
-              <w:pStyle w:val="10"/>
-              <w:pBdr>
-                <w:top w:val="nil"/>
-                <w:left w:val="nil"/>
-                <w:bottom w:val="nil"/>
-                <w:right w:val="nil"/>
-                <w:between w:val="nil"/>
-              </w:pBdr>
-              <w:rPr>
-                <w:color w:val="000000"/>
-                <w:lang/>
-              </w:rPr>
-            </w:pPr>
-            <w:r>
-              <w:rPr>
-                <w:color w:val="000000"/>
-                <w:lang/>
-              </w:rPr>
-              <w:lastRenderedPageBreak/>
-              <w:t xml:space="preserve">Скринкаст или текстовый </w:t>
-            </w:r>
-            <w:r>
-              <w:rPr>
-                <w:color w:val="000000"/>
-              </w:rPr>
-              <w:t>документ</w:t>
-            </w:r>
-            <w:r>
-              <w:rPr>
-                <w:color w:val="000000"/>
-                <w:lang/>
-              </w:rPr>
-              <w:t xml:space="preserve"> с демонстрацией выполненных действий и комментариями по их выполнению</w:t>
-            </w:r>
-            <w:r>
-              <w:rPr>
-                <w:color w:val="000000"/>
-              </w:rPr>
-              <w:t xml:space="preserve"> </w:t>
-            </w:r>
-            <w:r>
-              <w:rPr>
-                <w:color w:val="000000"/>
-              </w:rPr>
-              <w:t xml:space="preserve">(опубликовать в электронном портфолио, </w:t>
-            </w:r>
-            <w:r>
-              <w:rPr>
-                <w:color w:val="000000"/>
-                <w:lang w:val="en-US"/>
-              </w:rPr>
-              <w:t>QR</w:t>
-            </w:r>
-            <w:r>
-              <w:rPr>
-                <w:color w:val="000000"/>
-              </w:rPr>
-              <w:t>-код в отчете)</w:t>
-            </w:r>
-          </w:p>
-          <w:p>
-            <w:pPr>
-              <w:pStyle w:val="10"/>
-              <w:tabs>
-                <w:tab w:val="left" w:pos="-15"/>
-              </w:tabs>
-              <w:spacing w:after="200" w:line="276" w:lineRule="auto"/>
-              <w:rPr>
-                <w:rFonts w:ascii="Calibri" w:eastAsia="Calibri" w:hAnsi="Calibri" w:cs="Calibri"/>
-                <w:sz w:val="22"/>
-                <w:szCs w:val="22"/>
-              </w:rPr>
-            </w:pPr>
-          </w:p>
-        </w:tc>
-        <w:tc>
-          <w:tcPr>
-            <w:tcW w:w="1134" w:type="dxa"/>
-            <w:vMerge w:val="restart"/>
-            <w:tcBorders>
-              <w:top w:val="single" w:sz="4" w:space="0" w:color="000000"/>
-              <w:left w:val="single" w:sz="4" w:space="0" w:color="000000"/>
-              <w:bottom w:val="single" w:sz="4" w:space="0" w:color="000000"/>
-              <w:right w:val="single" w:sz="4" w:space="0" w:color="000000"/>
-            </w:tcBorders>
-          </w:tcPr>
-          <w:p>
-            <w:pPr>
-              <w:pStyle w:val="10"/>
-              <w:pBdr>
-                <w:top w:val="nil"/>
-                <w:left w:val="nil"/>
-                <w:bottom w:val="nil"/>
-                <w:right w:val="nil"/>
-                <w:between w:val="nil"/>
-              </w:pBdr>
-              <w:jc w:val="both"/>
-              <w:rPr>
-                <w:color w:val="000000"/>
-                <w:sz w:val="20"/>
-                <w:szCs w:val="20"/>
-              </w:rPr>
-            </w:pPr>
-          </w:p>
-        </w:tc>
-        <w:tc>
-          <w:tcPr>
-            <w:tcW w:w="1498" w:type="dxa"/>
-            <w:vMerge w:val="restart"/>
-            <w:tcBorders>
-              <w:top w:val="single" w:sz="4" w:space="0" w:color="000000"/>
-              <w:left w:val="single" w:sz="4" w:space="0" w:color="000000"/>
-              <w:bottom w:val="single" w:sz="4" w:space="0" w:color="000000"/>
-              <w:right w:val="single" w:sz="4" w:space="0" w:color="000000"/>
-            </w:tcBorders>
-          </w:tcPr>
-          <w:p>
-            <w:pPr>
-              <w:pStyle w:val="10"/>
-              <w:pBdr>
-                <w:top w:val="nil"/>
-                <w:left w:val="nil"/>
-                <w:bottom w:val="nil"/>
-                <w:right w:val="nil"/>
-                <w:between w:val="nil"/>
-              </w:pBdr>
-              <w:jc w:val="both"/>
-              <w:rPr>
-                <w:sz w:val="20"/>
-                <w:szCs w:val="20"/>
-              </w:rPr>
-            </w:pPr>
-          </w:p>
-          <w:p>
-            <w:pPr>
-              <w:pStyle w:val="10"/>
-              <w:pBdr>
-                <w:top w:val="nil"/>
-                <w:left w:val="nil"/>
-                <w:bottom w:val="nil"/>
-                <w:right w:val="nil"/>
-                <w:between w:val="nil"/>
-              </w:pBdr>
-              <w:jc w:val="both"/>
-              <w:rPr>
-                <w:sz w:val="20"/>
-                <w:szCs w:val="20"/>
-              </w:rPr>
-            </w:pPr>
-          </w:p>
-        </w:tc>
-      </w:tr>
-      <w:tr>
-        <w:trPr>
-          <w:trHeight w:val="480"/>
-        </w:trPr>
-        <w:tc>
-          <w:tcPr>
-            <w:tcW w:w="4536" w:type="dxa"/>
-            <w:vMerge/>
-            <w:tcBorders>
-              <w:top w:val="single" w:sz="4" w:space="0" w:color="000000"/>
-              <w:left w:val="single" w:sz="4" w:space="0" w:color="000000"/>
-              <w:bottom w:val="single" w:sz="4" w:space="0" w:color="000000"/>
-              <w:right w:val="single" w:sz="4" w:space="0" w:color="000000"/>
-            </w:tcBorders>
-          </w:tcPr>
-          <w:p>
-            <w:pPr>
-              <w:pStyle w:val="10"/>
-              <w:tabs>
-                <w:tab w:val="left" w:pos="560"/>
-                <w:tab w:val="left" w:pos="1120"/>
-                <w:tab w:val="left" w:pos="1680"/>
-                <w:tab w:val="left" w:pos="2240"/>
-                <w:tab w:val="left" w:pos="2800"/>
-                <w:tab w:val="left" w:pos="3360"/>
-                <w:tab w:val="left" w:pos="3920"/>
-                <w:tab w:val="left" w:pos="4480"/>
-                <w:tab w:val="left" w:pos="5040"/>
-                <w:tab w:val="left" w:pos="5600"/>
-                <w:tab w:val="left" w:pos="6160"/>
-                <w:tab w:val="left" w:pos="6720"/>
-              </w:tabs>
-              <w:jc w:val="both"/>
-            </w:pPr>
-          </w:p>
-        </w:tc>
-        <w:tc>
-          <w:tcPr>
-            <w:tcW w:w="2552" w:type="dxa"/>
-            <w:vMerge/>
-            <w:tcBorders>
-              <w:top w:val="single" w:sz="4" w:space="0" w:color="000000"/>
-              <w:left w:val="single" w:sz="4" w:space="0" w:color="000000"/>
-              <w:bottom w:val="single" w:sz="4" w:space="0" w:color="000000"/>
-              <w:right w:val="single" w:sz="4" w:space="0" w:color="000000"/>
-            </w:tcBorders>
-          </w:tcPr>
-          <w:p>
-            <w:pPr>
-              <w:pStyle w:val="10"/>
-              <w:tabs>
-                <w:tab w:val="left" w:pos="-15"/>
-              </w:tabs>
-              <w:rPr>
-                <w:rFonts w:ascii="Calibri" w:eastAsia="Calibri" w:hAnsi="Calibri" w:cs="Calibri"/>
-                <w:sz w:val="22"/>
-                <w:szCs w:val="22"/>
-              </w:rPr>
-            </w:pPr>
-          </w:p>
-        </w:tc>
-        <w:tc>
-          <w:tcPr>
-            <w:tcW w:w="1134" w:type="dxa"/>
-            <w:vMerge/>
-            <w:tcBorders>
-              <w:top w:val="single" w:sz="4" w:space="0" w:color="000000"/>
-              <w:left w:val="single" w:sz="4" w:space="0" w:color="000000"/>
-              <w:bottom w:val="single" w:sz="4" w:space="0" w:color="000000"/>
-              <w:right w:val="single" w:sz="4" w:space="0" w:color="000000"/>
-            </w:tcBorders>
-          </w:tcPr>
-          <w:p>
-            <w:pPr>
-              <w:pStyle w:val="10"/>
-              <w:pBdr>
-                <w:top w:val="nil"/>
-                <w:left w:val="nil"/>
-                <w:bottom w:val="nil"/>
-                <w:right w:val="nil"/>
-                <w:between w:val="nil"/>
-              </w:pBdr>
-              <w:jc w:val="both"/>
-              <w:rPr>
-                <w:color w:val="000000"/>
-                <w:sz w:val="20"/>
-                <w:szCs w:val="20"/>
-              </w:rPr>
-            </w:pPr>
-          </w:p>
-        </w:tc>
-        <w:tc>
-          <w:tcPr>
-            <w:tcW w:w="1498" w:type="dxa"/>
-            <w:vMerge/>
-            <w:tcBorders>
-              <w:top w:val="single" w:sz="4" w:space="0" w:color="000000"/>
-              <w:left w:val="single" w:sz="4" w:space="0" w:color="000000"/>
-              <w:bottom w:val="single" w:sz="4" w:space="0" w:color="000000"/>
-              <w:right w:val="single" w:sz="4" w:space="0" w:color="000000"/>
-            </w:tcBorders>
-          </w:tcPr>
-          <w:p>
-            <w:pPr>
-              <w:pStyle w:val="10"/>
-              <w:pBdr>
-                <w:top w:val="nil"/>
-                <w:left w:val="nil"/>
-                <w:bottom w:val="nil"/>
-                <w:right w:val="nil"/>
-                <w:between w:val="nil"/>
-              </w:pBdr>
-              <w:jc w:val="both"/>
-              <w:rPr>
-                <w:sz w:val="20"/>
-                <w:szCs w:val="20"/>
-              </w:rPr>
-            </w:pPr>
-          </w:p>
-        </w:tc>
-      </w:tr>
-      <w:tr>
-        <w:trPr>
-          <w:trHeight w:val="480"/>
-        </w:trPr>
-        <w:tc>
-          <w:tcPr>
-            <w:tcW w:w="4536" w:type="dxa"/>
-            <w:vMerge/>
-            <w:tcBorders>
-              <w:top w:val="single" w:sz="4" w:space="0" w:color="000000"/>
-              <w:left w:val="single" w:sz="4" w:space="0" w:color="000000"/>
-              <w:bottom w:val="single" w:sz="4" w:space="0" w:color="000000"/>
-              <w:right w:val="single" w:sz="4" w:space="0" w:color="000000"/>
-            </w:tcBorders>
-          </w:tcPr>
-          <w:p>
-            <w:pPr>
-              <w:pStyle w:val="10"/>
-              <w:pBdr>
-                <w:top w:val="nil"/>
-                <w:left w:val="nil"/>
-                <w:bottom w:val="nil"/>
-                <w:right w:val="nil"/>
-                <w:between w:val="nil"/>
-              </w:pBdr>
-              <w:jc w:val="both"/>
-              <w:rPr>
-                <w:rFonts w:ascii="Calibri" w:eastAsia="Calibri" w:hAnsi="Calibri" w:cs="Calibri"/>
-                <w:color w:val="000000"/>
-                <w:sz w:val="22"/>
-                <w:szCs w:val="22"/>
-              </w:rPr>
-            </w:pPr>
-          </w:p>
-        </w:tc>
-        <w:tc>
-          <w:tcPr>
-            <w:tcW w:w="2552" w:type="dxa"/>
-            <w:vMerge/>
-            <w:tcBorders>
-              <w:top w:val="single" w:sz="4" w:space="0" w:color="000000"/>
-              <w:left w:val="single" w:sz="4" w:space="0" w:color="000000"/>
-              <w:bottom w:val="single" w:sz="4" w:space="0" w:color="000000"/>
-              <w:right w:val="single" w:sz="4" w:space="0" w:color="000000"/>
-            </w:tcBorders>
-          </w:tcPr>
-          <w:p>
-            <w:pPr>
-              <w:pStyle w:val="10"/>
-              <w:pBdr>
-                <w:top w:val="nil"/>
-                <w:left w:val="nil"/>
-                <w:bottom w:val="nil"/>
-                <w:right w:val="nil"/>
-                <w:between w:val="nil"/>
-              </w:pBdr>
-              <w:tabs>
-                <w:tab w:val="left" w:pos="-15"/>
-              </w:tabs>
-              <w:rPr>
-                <w:rFonts w:ascii="Calibri" w:eastAsia="Calibri" w:hAnsi="Calibri" w:cs="Calibri"/>
-                <w:color w:val="000000"/>
-                <w:sz w:val="22"/>
-                <w:szCs w:val="22"/>
-              </w:rPr>
-            </w:pPr>
-          </w:p>
-        </w:tc>
-        <w:tc>
-          <w:tcPr>
-            <w:tcW w:w="1134" w:type="dxa"/>
-            <w:vMerge/>
-            <w:tcBorders>
-              <w:top w:val="single" w:sz="4" w:space="0" w:color="000000"/>
-              <w:left w:val="single" w:sz="4" w:space="0" w:color="000000"/>
-              <w:bottom w:val="single" w:sz="4" w:space="0" w:color="000000"/>
-              <w:right w:val="single" w:sz="4" w:space="0" w:color="000000"/>
-            </w:tcBorders>
-          </w:tcPr>
-          <w:p>
-            <w:pPr>
-              <w:pStyle w:val="10"/>
-              <w:pBdr>
-                <w:top w:val="nil"/>
-                <w:left w:val="nil"/>
-                <w:bottom w:val="nil"/>
-                <w:right w:val="nil"/>
-                <w:between w:val="nil"/>
-              </w:pBdr>
-              <w:jc w:val="both"/>
-              <w:rPr>
-                <w:color w:val="000000"/>
-                <w:sz w:val="20"/>
-                <w:szCs w:val="20"/>
-              </w:rPr>
-            </w:pPr>
-          </w:p>
-        </w:tc>
-        <w:tc>
-          <w:tcPr>
-            <w:tcW w:w="1498" w:type="dxa"/>
-            <w:vMerge/>
-            <w:tcBorders>
-              <w:top w:val="single" w:sz="4" w:space="0" w:color="000000"/>
-              <w:left w:val="single" w:sz="4" w:space="0" w:color="000000"/>
-              <w:bottom w:val="single" w:sz="4" w:space="0" w:color="000000"/>
-              <w:right w:val="single" w:sz="4" w:space="0" w:color="000000"/>
-            </w:tcBorders>
-          </w:tcPr>
-          <w:p>
-            <w:pPr>
-              <w:pStyle w:val="10"/>
-              <w:pBdr>
-                <w:top w:val="nil"/>
-                <w:left w:val="nil"/>
-                <w:bottom w:val="nil"/>
-                <w:right w:val="nil"/>
-                <w:between w:val="nil"/>
-              </w:pBdr>
-              <w:jc w:val="both"/>
-              <w:rPr>
-                <w:color w:val="000000"/>
-                <w:sz w:val="20"/>
-                <w:szCs w:val="20"/>
-              </w:rPr>
-            </w:pPr>
-          </w:p>
-        </w:tc>
-      </w:tr>
-      <w:tr>
-        <w:trPr>
-          <w:trHeight w:val="480"/>
-        </w:trPr>
-        <w:tc>
-          <w:tcPr>
-            <w:tcW w:w="4536" w:type="dxa"/>
-            <w:tcBorders>
-              <w:top w:val="single" w:sz="4" w:space="0" w:color="000000"/>
-              <w:left w:val="single" w:sz="4" w:space="0" w:color="000000"/>
-              <w:bottom w:val="single" w:sz="4" w:space="0" w:color="000000"/>
-              <w:right w:val="single" w:sz="4" w:space="0" w:color="000000"/>
-            </w:tcBorders>
-          </w:tcPr>
+          </w:p>
           <w:p>
             <w:pPr>
               <w:pStyle w:val="10"/>
@@ -3960,6 +3520,539 @@
                 <w:tab w:val="left" w:pos="6720"/>
               </w:tabs>
               <w:spacing w:after="200" w:line="276" w:lineRule="auto"/>
+              <w:jc w:val="both"/>
+            </w:pPr>
+          </w:p>
+          <w:p>
+            <w:pPr>
+              <w:pStyle w:val="10"/>
+              <w:pBdr>
+                <w:top w:val="nil"/>
+                <w:left w:val="nil"/>
+                <w:bottom w:val="nil"/>
+                <w:right w:val="nil"/>
+                <w:between w:val="nil"/>
+              </w:pBdr>
+              <w:tabs>
+                <w:tab w:val="left" w:pos="560"/>
+                <w:tab w:val="left" w:pos="1120"/>
+                <w:tab w:val="left" w:pos="1680"/>
+                <w:tab w:val="left" w:pos="2240"/>
+                <w:tab w:val="left" w:pos="2800"/>
+                <w:tab w:val="left" w:pos="3360"/>
+                <w:tab w:val="left" w:pos="3920"/>
+                <w:tab w:val="left" w:pos="4480"/>
+                <w:tab w:val="left" w:pos="5040"/>
+                <w:tab w:val="left" w:pos="5600"/>
+                <w:tab w:val="left" w:pos="6160"/>
+                <w:tab w:val="left" w:pos="6720"/>
+              </w:tabs>
+              <w:spacing w:after="200" w:line="276" w:lineRule="auto"/>
+              <w:jc w:val="both"/>
+            </w:pPr>
+          </w:p>
+          <w:p>
+            <w:pPr>
+              <w:pStyle w:val="10"/>
+              <w:pBdr>
+                <w:top w:val="nil"/>
+                <w:left w:val="nil"/>
+                <w:bottom w:val="nil"/>
+                <w:right w:val="nil"/>
+                <w:between w:val="nil"/>
+              </w:pBdr>
+              <w:tabs>
+                <w:tab w:val="left" w:pos="560"/>
+                <w:tab w:val="left" w:pos="1120"/>
+                <w:tab w:val="left" w:pos="1680"/>
+                <w:tab w:val="left" w:pos="2240"/>
+                <w:tab w:val="left" w:pos="2800"/>
+                <w:tab w:val="left" w:pos="3360"/>
+                <w:tab w:val="left" w:pos="3920"/>
+                <w:tab w:val="left" w:pos="4480"/>
+                <w:tab w:val="left" w:pos="5040"/>
+                <w:tab w:val="left" w:pos="5600"/>
+                <w:tab w:val="left" w:pos="6160"/>
+                <w:tab w:val="left" w:pos="6720"/>
+              </w:tabs>
+              <w:spacing w:after="200" w:line="276" w:lineRule="auto"/>
+              <w:jc w:val="both"/>
+            </w:pPr>
+          </w:p>
+        </w:tc>
+        <w:tc>
+          <w:tcPr>
+            <w:tcW w:w="2552" w:type="dxa"/>
+            <w:vMerge w:val="restart"/>
+            <w:tcBorders>
+              <w:top w:val="single" w:sz="4" w:space="0" w:color="000000"/>
+              <w:left w:val="single" w:sz="4" w:space="0" w:color="000000"/>
+              <w:bottom w:val="single" w:sz="4" w:space="0" w:color="000000"/>
+              <w:right w:val="single" w:sz="4" w:space="0" w:color="000000"/>
+            </w:tcBorders>
+          </w:tcPr>
+          <w:p>
+            <w:pPr>
+              <w:pStyle w:val="10"/>
+              <w:pBdr>
+                <w:top w:val="nil"/>
+                <w:left w:val="nil"/>
+                <w:bottom w:val="nil"/>
+                <w:right w:val="nil"/>
+                <w:between w:val="nil"/>
+              </w:pBdr>
+              <w:rPr>
+                <w:color w:val="000000"/>
+              </w:rPr>
+            </w:pPr>
+            <w:proofErr w:type="spellStart"/>
+            <w:r>
+              <w:rPr>
+                <w:color w:val="000000"/>
+              </w:rPr>
+              <w:t>Скринкаст</w:t>
+            </w:r>
+            <w:proofErr w:type="spellEnd"/>
+            <w:r>
+              <w:rPr>
+                <w:color w:val="000000"/>
+              </w:rPr>
+              <w:t xml:space="preserve"> или текстовый </w:t>
+            </w:r>
+            <w:r>
+              <w:rPr>
+                <w:color w:val="000000"/>
+              </w:rPr>
+              <w:t>документ</w:t>
+            </w:r>
+            <w:r>
+              <w:rPr>
+                <w:color w:val="000000"/>
+              </w:rPr>
+              <w:t xml:space="preserve"> с демонстрацией выполненных действий и комментариями по их выполнению</w:t>
+            </w:r>
+            <w:r>
+              <w:rPr>
+                <w:color w:val="000000"/>
+              </w:rPr>
+              <w:t xml:space="preserve"> </w:t>
+            </w:r>
+            <w:r>
+              <w:rPr>
+                <w:color w:val="000000"/>
+              </w:rPr>
+              <w:t xml:space="preserve">(опубликовать в электронном портфолио, </w:t>
+            </w:r>
+            <w:r>
+              <w:rPr>
+                <w:color w:val="000000"/>
+                <w:lang w:val="en-US"/>
+              </w:rPr>
+              <w:t>QR</w:t>
+            </w:r>
+            <w:r>
+              <w:rPr>
+                <w:color w:val="000000"/>
+              </w:rPr>
+              <w:t>-код в отчете)</w:t>
+            </w:r>
+          </w:p>
+          <w:p>
+            <w:pPr>
+              <w:pStyle w:val="10"/>
+              <w:tabs>
+                <w:tab w:val="left" w:pos="-15"/>
+              </w:tabs>
+              <w:spacing w:after="200" w:line="276" w:lineRule="auto"/>
+              <w:rPr>
+                <w:rFonts w:ascii="Calibri" w:eastAsia="Calibri" w:hAnsi="Calibri" w:cs="Calibri"/>
+                <w:sz w:val="22"/>
+                <w:szCs w:val="22"/>
+              </w:rPr>
+            </w:pPr>
+          </w:p>
+        </w:tc>
+        <w:tc>
+          <w:tcPr>
+            <w:tcW w:w="1134" w:type="dxa"/>
+            <w:vMerge w:val="restart"/>
+            <w:tcBorders>
+              <w:top w:val="single" w:sz="4" w:space="0" w:color="000000"/>
+              <w:left w:val="single" w:sz="4" w:space="0" w:color="000000"/>
+              <w:bottom w:val="single" w:sz="4" w:space="0" w:color="000000"/>
+              <w:right w:val="single" w:sz="4" w:space="0" w:color="000000"/>
+            </w:tcBorders>
+          </w:tcPr>
+          <w:p>
+            <w:pPr>
+              <w:pStyle w:val="10"/>
+              <w:pBdr>
+                <w:top w:val="nil"/>
+                <w:left w:val="nil"/>
+                <w:bottom w:val="nil"/>
+                <w:right w:val="nil"/>
+                <w:between w:val="nil"/>
+              </w:pBdr>
+              <w:jc w:val="both"/>
+              <w:rPr>
+                <w:color w:val="000000"/>
+                <w:sz w:val="20"/>
+                <w:szCs w:val="20"/>
+              </w:rPr>
+            </w:pPr>
+            <w:r>
+              <w:rPr>
+                <w:color w:val="000000"/>
+                <w:sz w:val="20"/>
+                <w:szCs w:val="20"/>
+              </w:rPr>
+              <w:t>16.09.2024</w:t>
+            </w:r>
+          </w:p>
+        </w:tc>
+        <w:tc>
+          <w:tcPr>
+            <w:tcW w:w="1498" w:type="dxa"/>
+            <w:vMerge w:val="restart"/>
+            <w:tcBorders>
+              <w:top w:val="single" w:sz="4" w:space="0" w:color="000000"/>
+              <w:left w:val="single" w:sz="4" w:space="0" w:color="000000"/>
+              <w:bottom w:val="single" w:sz="4" w:space="0" w:color="000000"/>
+              <w:right w:val="single" w:sz="4" w:space="0" w:color="000000"/>
+            </w:tcBorders>
+          </w:tcPr>
+          <w:p>
+            <w:pPr>
+              <w:pStyle w:val="10"/>
+              <w:pBdr>
+                <w:top w:val="nil"/>
+                <w:left w:val="nil"/>
+                <w:bottom w:val="nil"/>
+                <w:right w:val="nil"/>
+                <w:between w:val="nil"/>
+              </w:pBdr>
+              <w:jc w:val="both"/>
+              <w:rPr>
+                <w:sz w:val="20"/>
+                <w:szCs w:val="20"/>
+              </w:rPr>
+            </w:pPr>
+            <w:r>
+              <w:rPr>
+                <w:sz w:val="20"/>
+                <w:szCs w:val="20"/>
+              </w:rPr>
+              <w:t>16.09.2024</w:t>
+            </w:r>
+          </w:p>
+          <w:p>
+            <w:pPr>
+              <w:pStyle w:val="10"/>
+              <w:pBdr>
+                <w:top w:val="nil"/>
+                <w:left w:val="nil"/>
+                <w:bottom w:val="nil"/>
+                <w:right w:val="nil"/>
+                <w:between w:val="nil"/>
+              </w:pBdr>
+              <w:jc w:val="both"/>
+              <w:rPr>
+                <w:sz w:val="20"/>
+                <w:szCs w:val="20"/>
+              </w:rPr>
+            </w:pPr>
+          </w:p>
+        </w:tc>
+      </w:tr>
+      <w:tr>
+        <w:trPr>
+          <w:trHeight w:val="480"/>
+        </w:trPr>
+        <w:tc>
+          <w:tcPr>
+            <w:tcW w:w="4536" w:type="dxa"/>
+            <w:vMerge/>
+            <w:tcBorders>
+              <w:top w:val="single" w:sz="4" w:space="0" w:color="000000"/>
+              <w:left w:val="single" w:sz="4" w:space="0" w:color="000000"/>
+              <w:bottom w:val="single" w:sz="4" w:space="0" w:color="000000"/>
+              <w:right w:val="single" w:sz="4" w:space="0" w:color="000000"/>
+            </w:tcBorders>
+          </w:tcPr>
+          <w:p>
+            <w:pPr>
+              <w:pStyle w:val="10"/>
+              <w:tabs>
+                <w:tab w:val="left" w:pos="560"/>
+                <w:tab w:val="left" w:pos="1120"/>
+                <w:tab w:val="left" w:pos="1680"/>
+                <w:tab w:val="left" w:pos="2240"/>
+                <w:tab w:val="left" w:pos="2800"/>
+                <w:tab w:val="left" w:pos="3360"/>
+                <w:tab w:val="left" w:pos="3920"/>
+                <w:tab w:val="left" w:pos="4480"/>
+                <w:tab w:val="left" w:pos="5040"/>
+                <w:tab w:val="left" w:pos="5600"/>
+                <w:tab w:val="left" w:pos="6160"/>
+                <w:tab w:val="left" w:pos="6720"/>
+              </w:tabs>
+              <w:jc w:val="both"/>
+            </w:pPr>
+          </w:p>
+        </w:tc>
+        <w:tc>
+          <w:tcPr>
+            <w:tcW w:w="2552" w:type="dxa"/>
+            <w:vMerge/>
+            <w:tcBorders>
+              <w:top w:val="single" w:sz="4" w:space="0" w:color="000000"/>
+              <w:left w:val="single" w:sz="4" w:space="0" w:color="000000"/>
+              <w:bottom w:val="single" w:sz="4" w:space="0" w:color="000000"/>
+              <w:right w:val="single" w:sz="4" w:space="0" w:color="000000"/>
+            </w:tcBorders>
+          </w:tcPr>
+          <w:p>
+            <w:pPr>
+              <w:pStyle w:val="10"/>
+              <w:tabs>
+                <w:tab w:val="left" w:pos="-15"/>
+              </w:tabs>
+              <w:rPr>
+                <w:rFonts w:ascii="Calibri" w:eastAsia="Calibri" w:hAnsi="Calibri" w:cs="Calibri"/>
+                <w:sz w:val="22"/>
+                <w:szCs w:val="22"/>
+              </w:rPr>
+            </w:pPr>
+          </w:p>
+        </w:tc>
+        <w:tc>
+          <w:tcPr>
+            <w:tcW w:w="1134" w:type="dxa"/>
+            <w:vMerge/>
+            <w:tcBorders>
+              <w:top w:val="single" w:sz="4" w:space="0" w:color="000000"/>
+              <w:left w:val="single" w:sz="4" w:space="0" w:color="000000"/>
+              <w:bottom w:val="single" w:sz="4" w:space="0" w:color="000000"/>
+              <w:right w:val="single" w:sz="4" w:space="0" w:color="000000"/>
+            </w:tcBorders>
+          </w:tcPr>
+          <w:p>
+            <w:pPr>
+              <w:pStyle w:val="10"/>
+              <w:pBdr>
+                <w:top w:val="nil"/>
+                <w:left w:val="nil"/>
+                <w:bottom w:val="nil"/>
+                <w:right w:val="nil"/>
+                <w:between w:val="nil"/>
+              </w:pBdr>
+              <w:jc w:val="both"/>
+              <w:rPr>
+                <w:color w:val="000000"/>
+                <w:sz w:val="20"/>
+                <w:szCs w:val="20"/>
+              </w:rPr>
+            </w:pPr>
+          </w:p>
+        </w:tc>
+        <w:tc>
+          <w:tcPr>
+            <w:tcW w:w="1498" w:type="dxa"/>
+            <w:vMerge/>
+            <w:tcBorders>
+              <w:top w:val="single" w:sz="4" w:space="0" w:color="000000"/>
+              <w:left w:val="single" w:sz="4" w:space="0" w:color="000000"/>
+              <w:bottom w:val="single" w:sz="4" w:space="0" w:color="000000"/>
+              <w:right w:val="single" w:sz="4" w:space="0" w:color="000000"/>
+            </w:tcBorders>
+          </w:tcPr>
+          <w:p>
+            <w:pPr>
+              <w:pStyle w:val="10"/>
+              <w:pBdr>
+                <w:top w:val="nil"/>
+                <w:left w:val="nil"/>
+                <w:bottom w:val="nil"/>
+                <w:right w:val="nil"/>
+                <w:between w:val="nil"/>
+              </w:pBdr>
+              <w:jc w:val="both"/>
+              <w:rPr>
+                <w:sz w:val="20"/>
+                <w:szCs w:val="20"/>
+              </w:rPr>
+            </w:pPr>
+          </w:p>
+        </w:tc>
+      </w:tr>
+      <w:tr>
+        <w:trPr>
+          <w:trHeight w:val="480"/>
+        </w:trPr>
+        <w:tc>
+          <w:tcPr>
+            <w:tcW w:w="4536" w:type="dxa"/>
+            <w:vMerge/>
+            <w:tcBorders>
+              <w:top w:val="single" w:sz="4" w:space="0" w:color="000000"/>
+              <w:left w:val="single" w:sz="4" w:space="0" w:color="000000"/>
+              <w:bottom w:val="single" w:sz="4" w:space="0" w:color="000000"/>
+              <w:right w:val="single" w:sz="4" w:space="0" w:color="000000"/>
+            </w:tcBorders>
+          </w:tcPr>
+          <w:p>
+            <w:pPr>
+              <w:pStyle w:val="10"/>
+              <w:pBdr>
+                <w:top w:val="nil"/>
+                <w:left w:val="nil"/>
+                <w:bottom w:val="nil"/>
+                <w:right w:val="nil"/>
+                <w:between w:val="nil"/>
+              </w:pBdr>
+              <w:jc w:val="both"/>
+              <w:rPr>
+                <w:rFonts w:ascii="Calibri" w:eastAsia="Calibri" w:hAnsi="Calibri" w:cs="Calibri"/>
+                <w:color w:val="000000"/>
+                <w:sz w:val="22"/>
+                <w:szCs w:val="22"/>
+              </w:rPr>
+            </w:pPr>
+          </w:p>
+        </w:tc>
+        <w:tc>
+          <w:tcPr>
+            <w:tcW w:w="2552" w:type="dxa"/>
+            <w:vMerge/>
+            <w:tcBorders>
+              <w:top w:val="single" w:sz="4" w:space="0" w:color="000000"/>
+              <w:left w:val="single" w:sz="4" w:space="0" w:color="000000"/>
+              <w:bottom w:val="single" w:sz="4" w:space="0" w:color="000000"/>
+              <w:right w:val="single" w:sz="4" w:space="0" w:color="000000"/>
+            </w:tcBorders>
+          </w:tcPr>
+          <w:p>
+            <w:pPr>
+              <w:pStyle w:val="10"/>
+              <w:pBdr>
+                <w:top w:val="nil"/>
+                <w:left w:val="nil"/>
+                <w:bottom w:val="nil"/>
+                <w:right w:val="nil"/>
+                <w:between w:val="nil"/>
+              </w:pBdr>
+              <w:tabs>
+                <w:tab w:val="left" w:pos="-15"/>
+              </w:tabs>
+              <w:rPr>
+                <w:rFonts w:ascii="Calibri" w:eastAsia="Calibri" w:hAnsi="Calibri" w:cs="Calibri"/>
+                <w:color w:val="000000"/>
+                <w:sz w:val="22"/>
+                <w:szCs w:val="22"/>
+              </w:rPr>
+            </w:pPr>
+          </w:p>
+        </w:tc>
+        <w:tc>
+          <w:tcPr>
+            <w:tcW w:w="1134" w:type="dxa"/>
+            <w:vMerge/>
+            <w:tcBorders>
+              <w:top w:val="single" w:sz="4" w:space="0" w:color="000000"/>
+              <w:left w:val="single" w:sz="4" w:space="0" w:color="000000"/>
+              <w:bottom w:val="single" w:sz="4" w:space="0" w:color="000000"/>
+              <w:right w:val="single" w:sz="4" w:space="0" w:color="000000"/>
+            </w:tcBorders>
+          </w:tcPr>
+          <w:p>
+            <w:pPr>
+              <w:pStyle w:val="10"/>
+              <w:pBdr>
+                <w:top w:val="nil"/>
+                <w:left w:val="nil"/>
+                <w:bottom w:val="nil"/>
+                <w:right w:val="nil"/>
+                <w:between w:val="nil"/>
+              </w:pBdr>
+              <w:jc w:val="both"/>
+              <w:rPr>
+                <w:color w:val="000000"/>
+                <w:sz w:val="20"/>
+                <w:szCs w:val="20"/>
+              </w:rPr>
+            </w:pPr>
+          </w:p>
+        </w:tc>
+        <w:tc>
+          <w:tcPr>
+            <w:tcW w:w="1498" w:type="dxa"/>
+            <w:vMerge/>
+            <w:tcBorders>
+              <w:top w:val="single" w:sz="4" w:space="0" w:color="000000"/>
+              <w:left w:val="single" w:sz="4" w:space="0" w:color="000000"/>
+              <w:bottom w:val="single" w:sz="4" w:space="0" w:color="000000"/>
+              <w:right w:val="single" w:sz="4" w:space="0" w:color="000000"/>
+            </w:tcBorders>
+          </w:tcPr>
+          <w:p>
+            <w:pPr>
+              <w:pStyle w:val="10"/>
+              <w:pBdr>
+                <w:top w:val="nil"/>
+                <w:left w:val="nil"/>
+                <w:bottom w:val="nil"/>
+                <w:right w:val="nil"/>
+                <w:between w:val="nil"/>
+              </w:pBdr>
+              <w:jc w:val="both"/>
+              <w:rPr>
+                <w:color w:val="000000"/>
+                <w:sz w:val="20"/>
+                <w:szCs w:val="20"/>
+              </w:rPr>
+            </w:pPr>
+          </w:p>
+        </w:tc>
+      </w:tr>
+      <w:tr>
+        <w:trPr>
+          <w:trHeight w:val="480"/>
+        </w:trPr>
+        <w:tc>
+          <w:tcPr>
+            <w:tcW w:w="4536" w:type="dxa"/>
+            <w:tcBorders>
+              <w:top w:val="single" w:sz="4" w:space="0" w:color="000000"/>
+              <w:left w:val="single" w:sz="4" w:space="0" w:color="000000"/>
+              <w:bottom w:val="single" w:sz="4" w:space="0" w:color="000000"/>
+              <w:right w:val="single" w:sz="4" w:space="0" w:color="000000"/>
+            </w:tcBorders>
+          </w:tcPr>
+          <w:p>
+            <w:pPr>
+              <w:pStyle w:val="10"/>
+              <w:pBdr>
+                <w:top w:val="nil"/>
+                <w:left w:val="nil"/>
+                <w:bottom w:val="nil"/>
+                <w:right w:val="nil"/>
+                <w:between w:val="nil"/>
+              </w:pBdr>
+              <w:tabs>
+                <w:tab w:val="left" w:pos="560"/>
+                <w:tab w:val="left" w:pos="1120"/>
+                <w:tab w:val="left" w:pos="1680"/>
+                <w:tab w:val="left" w:pos="2240"/>
+                <w:tab w:val="left" w:pos="2800"/>
+                <w:tab w:val="left" w:pos="3360"/>
+                <w:tab w:val="left" w:pos="3920"/>
+                <w:tab w:val="left" w:pos="4480"/>
+                <w:tab w:val="left" w:pos="5040"/>
+                <w:tab w:val="left" w:pos="5600"/>
+                <w:tab w:val="left" w:pos="6160"/>
+                <w:tab w:val="left" w:pos="6720"/>
+              </w:tabs>
+              <w:spacing w:after="200" w:line="276" w:lineRule="auto"/>
               <w:rPr>
                 <w:rFonts w:ascii="Calibri" w:eastAsia="Calibri" w:hAnsi="Calibri" w:cs="Calibri"/>
                 <w:color w:val="000000"/>
@@ -4023,7 +4116,15 @@
                   <w:color w:val="1155CC"/>
                   <w:u w:val="single"/>
                 </w:rPr>
-                <w:t>https://git.herzen.spb.ru/igossoudarev/clouds</w:t>
+                <w:t>https://git.herzen.spb.ru</w:t>
+              </w:r>
+              <w:r>
+                <w:rPr>
+                  <w:color w:val="1155CC"/>
+                  <w:u w:val="single"/>
+                </w:rPr>
+                <w:lastRenderedPageBreak/>
+                <w:t>/igossoudarev/clouds</w:t>
               </w:r>
             </w:hyperlink>
             <w:r>
@@ -4059,6 +4160,7 @@
             <w:r>
               <w:t xml:space="preserve"> </w:t>
             </w:r>
+            <w:proofErr w:type="gramStart"/>
             <w:r>
               <w:rPr>
                 <w:color w:val="1155CC"/>
@@ -4067,7 +4169,11 @@
               <w:t>https://moodle.herzen.spb.ru/course/view.php?id=20206</w:t>
             </w:r>
             <w:r>
-              <w:t xml:space="preserve">  в разделе, посвящённом результатам практики, а также в отчёте.</w:t>
+              <w:t xml:space="preserve">  в</w:t>
+            </w:r>
+            <w:proofErr w:type="gramEnd"/>
+            <w:r>
+              <w:t xml:space="preserve"> разделе, посвящённом результатам практики, а также в отчёте.</w:t>
             </w:r>
           </w:p>
           <w:p>
@@ -4165,6 +4271,23 @@
                 <w:szCs w:val="20"/>
               </w:rPr>
             </w:pPr>
+            <w:r>
+              <w:rPr>
+                <w:color w:val="000000"/>
+                <w:sz w:val="20"/>
+                <w:szCs w:val="20"/>
+              </w:rPr>
+              <w:lastRenderedPageBreak/>
+              <w:t>3</w:t>
+            </w:r>
+            <w:r>
+              <w:rPr>
+                <w:color w:val="000000"/>
+                <w:sz w:val="20"/>
+                <w:szCs w:val="20"/>
+              </w:rPr>
+              <w:t>.09.2024</w:t>
+            </w:r>
           </w:p>
         </w:tc>
         <w:tc>
@@ -4194,6 +4317,14 @@
                 <w:szCs w:val="20"/>
               </w:rPr>
             </w:pPr>
+            <w:r>
+              <w:rPr>
+                <w:color w:val="000000"/>
+                <w:sz w:val="20"/>
+                <w:szCs w:val="20"/>
+              </w:rPr>
+              <w:t>26.09.2024</w:t>
+            </w:r>
           </w:p>
         </w:tc>
       </w:tr>
@@ -4267,14 +4398,6 @@
           <w:szCs w:val="20"/>
         </w:rPr>
         <w:t>практики ________________________________</w:t>
-      </w:r>
-      <w:r>
-        <w:rPr>
-          <w:color w:val="000000"/>
-          <w:sz w:val="20"/>
-          <w:szCs w:val="20"/>
-        </w:rPr>
-        <w:t>.</w:t>
       </w:r>
     </w:p>
     <w:p>
@@ -4321,6 +4444,7 @@
           <w:color w:val="000000"/>
           <w:sz w:val="20"/>
           <w:szCs w:val="20"/>
+          <w:u w:val="single"/>
         </w:rPr>
       </w:pPr>
       <w:r>
@@ -4337,15 +4461,16 @@
           <w:sz w:val="20"/>
           <w:szCs w:val="20"/>
         </w:rPr>
-        <w:t xml:space="preserve"> исполнению «</w:t>
-      </w:r>
+        <w:t xml:space="preserve"> исполнению </w:t>
+      </w:r>
+      <w:proofErr w:type="gramStart"/>
       <w:r>
         <w:rPr>
           <w:color w:val="000000"/>
           <w:sz w:val="20"/>
           <w:szCs w:val="20"/>
         </w:rPr>
-        <w:t xml:space="preserve"> 4 </w:t>
+        <w:t>«</w:t>
       </w:r>
       <w:r>
         <w:rPr>
@@ -4353,15 +4478,16 @@
           <w:sz w:val="20"/>
           <w:szCs w:val="20"/>
         </w:rPr>
-        <w:t xml:space="preserve">» </w:t>
-      </w:r>
+        <w:t xml:space="preserve"> 4</w:t>
+      </w:r>
+      <w:proofErr w:type="gramEnd"/>
       <w:r>
         <w:rPr>
           <w:color w:val="000000"/>
           <w:sz w:val="20"/>
           <w:szCs w:val="20"/>
         </w:rPr>
-        <w:t xml:space="preserve">сентября </w:t>
+        <w:t xml:space="preserve"> </w:t>
       </w:r>
       <w:r>
         <w:rPr>
@@ -4369,7 +4495,7 @@
           <w:sz w:val="20"/>
           <w:szCs w:val="20"/>
         </w:rPr>
-        <w:t>20</w:t>
+        <w:t xml:space="preserve">» </w:t>
       </w:r>
       <w:r>
         <w:rPr>
@@ -4377,7 +4503,7 @@
           <w:sz w:val="20"/>
           <w:szCs w:val="20"/>
         </w:rPr>
-        <w:t>24</w:t>
+        <w:t xml:space="preserve">сентября </w:t>
       </w:r>
       <w:r>
         <w:rPr>
@@ -4385,7 +4511,48 @@
           <w:sz w:val="20"/>
           <w:szCs w:val="20"/>
         </w:rPr>
-        <w:t xml:space="preserve"> г.  _____________________ ______________</w:t>
+        <w:t>20</w:t>
+      </w:r>
+      <w:r>
+        <w:rPr>
+          <w:color w:val="000000"/>
+          <w:sz w:val="20"/>
+          <w:szCs w:val="20"/>
+        </w:rPr>
+        <w:t>24</w:t>
+      </w:r>
+      <w:r>
+        <w:rPr>
+          <w:color w:val="000000"/>
+          <w:sz w:val="20"/>
+          <w:szCs w:val="20"/>
+        </w:rPr>
+        <w:t xml:space="preserve"> г.  _____________________ </w:t>
+      </w:r>
+      <w:r>
+        <w:rPr>
+          <w:color w:val="000000"/>
+          <w:sz w:val="20"/>
+          <w:szCs w:val="20"/>
+        </w:rPr>
+        <w:t xml:space="preserve">       </w:t>
+      </w:r>
+      <w:r>
+        <w:rPr>
+          <w:color w:val="000000"/>
+          <w:sz w:val="20"/>
+          <w:szCs w:val="20"/>
+        </w:rPr>
+        <w:t>______________</w:t>
+      </w:r>
+      <w:r>
+        <w:rPr>
+          <w:color w:val="000000"/>
+          <w:sz w:val="20"/>
+          <w:szCs w:val="20"/>
+          <w:u w:val="single"/>
+        </w:rPr>
+        <w:t xml:space="preserve">     </w:t>
       </w:r>
     </w:p>
     <w:p>

</xml_diff>